<commit_message>
Contributions Report: add the typed audiovisual translation notes
Co-Authored-By: Claude Opus 5.5 <noreply@anthropic.com>
Claude-Session: https://claude.ai/code/session_01VkNWz9zCVkDAANuF8jpQYy
</commit_message>
<xml_diff>
--- a/Handbook-Contributions-Report.docx
+++ b/Handbook-Contributions-Report.docx
@@ -3589,6 +3589,18 @@
     </w:p>
     <w:p>
       <w:pPr>
+        <w:spacing w:after="140" w:line="300"/>
+        <w:jc w:val="both"/>
+      </w:pPr>
+      <w:r>
+        <w:rPr>
+          <w:rFonts w:ascii="Arial" w:cs="Arial" w:eastAsia="Arial" w:hAnsi="Arial"/>
+        </w:rPr>
+        <w:t xml:space="preserve">A typed and organised version of the same notes (Audiovisual Translation.docx), posted by Samiuallah Mohammad, was compared with Chapters 26 and 27. It contains no new material: everything suitable for beginners was already in the handbook, and the parts left out are the same as below. It still gives the old line length (32 to 41 characters), which the handbook corrects. The parts left out would suit the website, as Samiuallah Mohammad suggested.</w:t>
+      </w:r>
+    </w:p>
+    <w:p>
+      <w:pPr>
         <w:pStyle w:val="Heading2"/>
       </w:pPr>
       <w:r>
@@ -7024,7 +7036,7 @@
         <w:rPr>
           <w:rFonts w:ascii="Arial" w:cs="Arial" w:eastAsia="Arial" w:hAnsi="Arial"/>
         </w:rPr>
-        <w:t xml:space="preserve">Material received: the first draft (Draft_one), the plan and recommendations (Latest updates and thoughts), the 180 course notes (typed and scanned), the Translation 1 notes, the notes on Farghal &amp; Shunnaq, the Text Analysis Model, the text </w:t>
+        <w:t xml:space="preserve">Material received: the typed version of the audiovisual translation notes (see Section 4), the first draft (Draft_one), the plan and recommendations (Latest updates and thoughts), the 180 course notes (typed and scanned), the Translation 1 notes, the notes on Farghal &amp; Shunnaq, the Text Analysis Model, the text </w:t>
       </w:r>
       <w:r>
         <w:rPr>

</xml_diff>

<commit_message>
Review every example; add workflow and When in doubt pages
- Every example checked against the team's documents and Shaikha's
  notes: team examples kept and corrected; weak examples replaced,
  preferably with team examples; three challenge questions added
- New one-page guides: The translator's workflow (with Do/Don't boxes)
  and When in doubt
- Absolute rules reworded as tendencies; preferred Arabic term shown
  first where two equivalents exist; positioning line and tagline
- Reports updated (96 pages)

Co-Authored-By: Claude Opus 5.5 <noreply@anthropic.com>
Claude-Session: https://claude.ai/code/session_01VkNWz9zCVkDAANuF8jpQYy
</commit_message>
<xml_diff>
--- a/Handbook-Contributions-Report.docx
+++ b/Handbook-Contributions-Report.docx
@@ -191,7 +191,7 @@
         <w:rPr>
           <w:rFonts w:ascii="Arial" w:cs="Arial" w:eastAsia="Arial" w:hAnsi="Arial"/>
         </w:rPr>
-        <w:t xml:space="preserve">The report follows the current draft: two editions (Midnight and Light) with the same content, 92 pages, 9 parts and 27 chapters, an opening section (</w:t>
+        <w:t xml:space="preserve">The report follows the current draft: two editions (Midnight and Light) with the same content, 96 pages, 9 parts and 27 chapters, an opening section (</w:t>
       </w:r>
       <w:r>
         <w:rPr>
@@ -2059,7 +2059,71 @@
                 <w:sz w:val="19"/>
                 <w:szCs w:val="19"/>
               </w:rPr>
-              <w:t xml:space="preserve">—</w:t>
+              <w:t xml:space="preserve">Examples from Samiuallah’s Farghal &amp; Shunnaq notes and draft: </w:t>
+            </w:r>
+            <w:r>
+              <w:rPr>
+                <w:rFonts w:ascii="Arial" w:cs="Arial" w:eastAsia="Arial" w:hAnsi="Arial"/>
+                <w:i/>
+                <w:iCs/>
+                <w:sz w:val="19"/>
+                <w:szCs w:val="19"/>
+              </w:rPr>
+              <w:t xml:space="preserve">shadow government</w:t>
+            </w:r>
+            <w:r>
+              <w:rPr>
+                <w:rFonts w:ascii="Arial" w:cs="Arial" w:eastAsia="Arial" w:hAnsi="Arial"/>
+                <w:sz w:val="19"/>
+                <w:szCs w:val="19"/>
+              </w:rPr>
+              <w:t xml:space="preserve">, </w:t>
+            </w:r>
+            <w:r>
+              <w:rPr>
+                <w:rFonts w:ascii="Arial" w:cs="Arial" w:eastAsia="Arial" w:hAnsi="Arial"/>
+                <w:i/>
+                <w:iCs/>
+                <w:sz w:val="19"/>
+                <w:szCs w:val="19"/>
+              </w:rPr>
+              <w:t xml:space="preserve">My friend speaks German fluently</w:t>
+            </w:r>
+            <w:r>
+              <w:rPr>
+                <w:rFonts w:ascii="Arial" w:cs="Arial" w:eastAsia="Arial" w:hAnsi="Arial"/>
+                <w:sz w:val="19"/>
+                <w:szCs w:val="19"/>
+              </w:rPr>
+              <w:t xml:space="preserve">, </w:t>
+            </w:r>
+            <w:r>
+              <w:rPr>
+                <w:rFonts w:ascii="Arial" w:cs="Arial" w:eastAsia="Arial" w:hAnsi="Arial"/>
+                <w:i/>
+                <w:iCs/>
+                <w:sz w:val="19"/>
+                <w:szCs w:val="19"/>
+              </w:rPr>
+              <w:t xml:space="preserve">A burnt child dreads the fire</w:t>
+            </w:r>
+            <w:r>
+              <w:rPr>
+                <w:rFonts w:ascii="Arial" w:cs="Arial" w:eastAsia="Arial" w:hAnsi="Arial"/>
+                <w:sz w:val="19"/>
+                <w:szCs w:val="19"/>
+              </w:rPr>
+              <w:t xml:space="preserve">, </w:t>
+            </w:r>
+            <w:r>
+              <w:rPr>
+                <w:rFonts w:ascii="Arial" w:cs="Arial" w:eastAsia="Arial" w:hAnsi="Arial"/>
+                <w:i/>
+                <w:iCs/>
+                <w:sz w:val="19"/>
+                <w:szCs w:val="19"/>
+              </w:rPr>
+              <w:t xml:space="preserve">garage</w:t>
             </w:r>
           </w:p>
         </w:tc>
@@ -12578,7 +12642,7 @@
           <w:i/>
           <w:iCs/>
         </w:rPr>
-        <w:t xml:space="preserve">weak coffee</w:t>
+        <w:t xml:space="preserve">Ali often goes to bed early</w:t>
       </w:r>
       <w:r>
         <w:rPr>
@@ -12592,7 +12656,49 @@
           <w:i/>
           <w:iCs/>
         </w:rPr>
+        <w:t xml:space="preserve">The students are in the laboratory</w:t>
+      </w:r>
+      <w:r>
+        <w:rPr>
+          <w:rFonts w:ascii="Arial" w:cs="Arial" w:eastAsia="Arial" w:hAnsi="Arial"/>
+        </w:rPr>
+        <w:t xml:space="preserve"> (Chapter 4); </w:t>
+      </w:r>
+      <w:r>
+        <w:rPr>
+          <w:rFonts w:ascii="Arial" w:cs="Arial" w:eastAsia="Arial" w:hAnsi="Arial"/>
+          <w:i/>
+          <w:iCs/>
+        </w:rPr>
+        <w:t xml:space="preserve">weak coffee</w:t>
+      </w:r>
+      <w:r>
+        <w:rPr>
+          <w:rFonts w:ascii="Arial" w:cs="Arial" w:eastAsia="Arial" w:hAnsi="Arial"/>
+        </w:rPr>
+        <w:t xml:space="preserve">, </w:t>
+      </w:r>
+      <w:r>
+        <w:rPr>
+          <w:rFonts w:ascii="Arial" w:cs="Arial" w:eastAsia="Arial" w:hAnsi="Arial"/>
+          <w:i/>
+          <w:iCs/>
+        </w:rPr>
         <w:t xml:space="preserve">a rough sea</w:t>
+      </w:r>
+      <w:r>
+        <w:rPr>
+          <w:rFonts w:ascii="Arial" w:cs="Arial" w:eastAsia="Arial" w:hAnsi="Arial"/>
+        </w:rPr>
+        <w:t xml:space="preserve"> and the collocations of </w:t>
+      </w:r>
+      <w:r>
+        <w:rPr>
+          <w:rFonts w:ascii="Arial" w:cs="Arial" w:hAnsi="Arial"/>
+          <w:szCs w:val="23"/>
+          <w:rtl/>
+        </w:rPr>
+        <w:t xml:space="preserve">يقطع</w:t>
       </w:r>
       <w:r>
         <w:rPr>
@@ -12612,7 +12718,35 @@
         <w:rPr>
           <w:rFonts w:ascii="Arial" w:cs="Arial" w:eastAsia="Arial" w:hAnsi="Arial"/>
         </w:rPr>
-        <w:t xml:space="preserve"> (Chapter 9); the citation of Farghal &amp; Shunnaq in Chapters 4, 10, 12 and 15–17, in the 2011 edition the team used. The draft’s numbered exercises come from this book.</w:t>
+        <w:t xml:space="preserve"> and </w:t>
+      </w:r>
+      <w:r>
+        <w:rPr>
+          <w:rFonts w:ascii="Arial" w:cs="Arial" w:eastAsia="Arial" w:hAnsi="Arial"/>
+          <w:i/>
+          <w:iCs/>
+        </w:rPr>
+        <w:t xml:space="preserve">Business is business</w:t>
+      </w:r>
+      <w:r>
+        <w:rPr>
+          <w:rFonts w:ascii="Arial" w:cs="Arial" w:eastAsia="Arial" w:hAnsi="Arial"/>
+        </w:rPr>
+        <w:t xml:space="preserve"> (</w:t>
+      </w:r>
+      <w:r>
+        <w:rPr>
+          <w:rFonts w:ascii="Arial" w:cs="Arial" w:hAnsi="Arial"/>
+          <w:szCs w:val="23"/>
+          <w:rtl/>
+        </w:rPr>
+        <w:t xml:space="preserve">الشغل شغل</w:t>
+      </w:r>
+      <w:r>
+        <w:rPr>
+          <w:rFonts w:ascii="Arial" w:cs="Arial" w:eastAsia="Arial" w:hAnsi="Arial"/>
+        </w:rPr>
+        <w:t xml:space="preserve">) (Chapter 9); four examples of the seven procedures (Chapter 13); the citation of Farghal &amp; Shunnaq in Chapters 4, 10, 12 and 15–17, in the 2011 edition the team used. The draft’s numbered exercises come from this book.</w:t>
       </w:r>
     </w:p>
     <w:p>
@@ -13250,7 +13384,7 @@
                 <w:sz w:val="19"/>
                 <w:szCs w:val="19"/>
               </w:rPr>
-              <w:t xml:space="preserve">; the dual; the gender of </w:t>
+              <w:t xml:space="preserve"> (</w:t>
             </w:r>
             <w:r>
               <w:rPr>
@@ -13260,15 +13394,32 @@
                 <w:sz w:val="19"/>
                 <w:szCs w:val="19"/>
               </w:rPr>
-              <w:t xml:space="preserve">I</w:t>
-            </w:r>
-            <w:r>
-              <w:rPr>
-                <w:rFonts w:ascii="Arial" w:cs="Arial" w:eastAsia="Arial" w:hAnsi="Arial"/>
-                <w:sz w:val="19"/>
-                <w:szCs w:val="19"/>
-              </w:rPr>
-              <w:t xml:space="preserve"> and </w:t>
+              <w:t xml:space="preserve">She has her pills on time</w:t>
+            </w:r>
+            <w:r>
+              <w:rPr>
+                <w:rFonts w:ascii="Arial" w:cs="Arial" w:eastAsia="Arial" w:hAnsi="Arial"/>
+                <w:sz w:val="19"/>
+                <w:szCs w:val="19"/>
+              </w:rPr>
+              <w:t xml:space="preserve">); the dual (</w:t>
+            </w:r>
+            <w:r>
+              <w:rPr>
+                <w:rFonts w:ascii="Arial" w:cs="Arial" w:hAnsi="Arial"/>
+                <w:sz w:val="19"/>
+                <w:szCs w:val="20"/>
+                <w:rtl/>
+              </w:rPr>
+              <w:t xml:space="preserve">المحكمان</w:t>
+            </w:r>
+            <w:r>
+              <w:rPr>
+                <w:rFonts w:ascii="Arial" w:cs="Arial" w:eastAsia="Arial" w:hAnsi="Arial"/>
+                <w:sz w:val="19"/>
+                <w:szCs w:val="19"/>
+              </w:rPr>
+              <w:t xml:space="preserve">); the gender of </w:t>
             </w:r>
             <w:r>
               <w:rPr>
@@ -13278,6 +13429,24 @@
                 <w:sz w:val="19"/>
                 <w:szCs w:val="19"/>
               </w:rPr>
+              <w:t xml:space="preserve">I</w:t>
+            </w:r>
+            <w:r>
+              <w:rPr>
+                <w:rFonts w:ascii="Arial" w:cs="Arial" w:eastAsia="Arial" w:hAnsi="Arial"/>
+                <w:sz w:val="19"/>
+                <w:szCs w:val="19"/>
+              </w:rPr>
+              <w:t xml:space="preserve"> and </w:t>
+            </w:r>
+            <w:r>
+              <w:rPr>
+                <w:rFonts w:ascii="Arial" w:cs="Arial" w:eastAsia="Arial" w:hAnsi="Arial"/>
+                <w:i/>
+                <w:iCs/>
+                <w:sz w:val="19"/>
+                <w:szCs w:val="19"/>
+              </w:rPr>
               <w:t xml:space="preserve">you</w:t>
             </w:r>
           </w:p>
@@ -14416,6 +14585,136 @@
                 <w:szCs w:val="19"/>
               </w:rPr>
               <w:t xml:space="preserve">Whole book</w:t>
+            </w:r>
+          </w:p>
+        </w:tc>
+      </w:tr>
+      <w:tr>
+        <w:trPr>
+          <w:cantSplit/>
+        </w:trPr>
+        <w:tc>
+          <w:tcPr>
+            <w:tcW w:type="dxa" w:w="5624"/>
+            <w:tcBorders>
+              <w:top w:val="single" w:color="000000" w:sz="4"/>
+              <w:left w:val="single" w:color="000000" w:sz="4"/>
+              <w:bottom w:val="single" w:color="000000" w:sz="4"/>
+              <w:right w:val="single" w:color="000000" w:sz="4"/>
+            </w:tcBorders>
+            <w:tcMar>
+              <w:top w:type="dxa" w:w="60"/>
+              <w:left w:type="dxa" w:w="100"/>
+              <w:bottom w:type="dxa" w:w="60"/>
+              <w:right w:type="dxa" w:w="100"/>
+            </w:tcMar>
+          </w:tcPr>
+          <w:p>
+            <w:pPr>
+              <w:spacing w:after="0" w:line="260"/>
+            </w:pPr>
+            <w:r>
+              <w:rPr>
+                <w:rFonts w:ascii="Arial" w:cs="Arial" w:eastAsia="Arial" w:hAnsi="Arial"/>
+                <w:sz w:val="19"/>
+                <w:szCs w:val="19"/>
+              </w:rPr>
+              <w:t xml:space="preserve">Wrote two one-page guides: The translator’s workflow (with Do and Don’t boxes) and When in doubt</w:t>
+            </w:r>
+          </w:p>
+        </w:tc>
+        <w:tc>
+          <w:tcPr>
+            <w:tcW w:type="dxa" w:w="3447"/>
+            <w:tcBorders>
+              <w:top w:val="single" w:color="000000" w:sz="4"/>
+              <w:left w:val="single" w:color="000000" w:sz="4"/>
+              <w:bottom w:val="single" w:color="000000" w:sz="4"/>
+              <w:right w:val="single" w:color="000000" w:sz="4"/>
+            </w:tcBorders>
+            <w:tcMar>
+              <w:top w:type="dxa" w:w="60"/>
+              <w:left w:type="dxa" w:w="100"/>
+              <w:bottom w:type="dxa" w:w="60"/>
+              <w:right w:type="dxa" w:w="100"/>
+            </w:tcMar>
+          </w:tcPr>
+          <w:p>
+            <w:pPr>
+              <w:spacing w:after="0" w:line="260"/>
+            </w:pPr>
+            <w:r>
+              <w:rPr>
+                <w:rFonts w:ascii="Arial" w:cs="Arial" w:eastAsia="Arial" w:hAnsi="Arial"/>
+                <w:sz w:val="19"/>
+                <w:szCs w:val="19"/>
+              </w:rPr>
+              <w:t xml:space="preserve">End of Part 1; before the closing section</w:t>
+            </w:r>
+          </w:p>
+        </w:tc>
+      </w:tr>
+      <w:tr>
+        <w:trPr>
+          <w:cantSplit/>
+        </w:trPr>
+        <w:tc>
+          <w:tcPr>
+            <w:tcW w:type="dxa" w:w="5624"/>
+            <w:tcBorders>
+              <w:top w:val="single" w:color="000000" w:sz="4"/>
+              <w:left w:val="single" w:color="000000" w:sz="4"/>
+              <w:bottom w:val="single" w:color="000000" w:sz="4"/>
+              <w:right w:val="single" w:color="000000" w:sz="4"/>
+            </w:tcBorders>
+            <w:tcMar>
+              <w:top w:type="dxa" w:w="60"/>
+              <w:left w:type="dxa" w:w="100"/>
+              <w:bottom w:type="dxa" w:w="60"/>
+              <w:right w:type="dxa" w:w="100"/>
+            </w:tcMar>
+          </w:tcPr>
+          <w:p>
+            <w:pPr>
+              <w:spacing w:after="0" w:line="260"/>
+            </w:pPr>
+            <w:r>
+              <w:rPr>
+                <w:rFonts w:ascii="Arial" w:cs="Arial" w:eastAsia="Arial" w:hAnsi="Arial"/>
+                <w:sz w:val="19"/>
+                <w:szCs w:val="19"/>
+              </w:rPr>
+              <w:t xml:space="preserve">Reviewed every example against the team’s documents and her notes: team examples kept and corrected; weak examples replaced, preferably with team examples; challenge questions added</w:t>
+            </w:r>
+          </w:p>
+        </w:tc>
+        <w:tc>
+          <w:tcPr>
+            <w:tcW w:type="dxa" w:w="3447"/>
+            <w:tcBorders>
+              <w:top w:val="single" w:color="000000" w:sz="4"/>
+              <w:left w:val="single" w:color="000000" w:sz="4"/>
+              <w:bottom w:val="single" w:color="000000" w:sz="4"/>
+              <w:right w:val="single" w:color="000000" w:sz="4"/>
+            </w:tcBorders>
+            <w:tcMar>
+              <w:top w:type="dxa" w:w="60"/>
+              <w:left w:type="dxa" w:w="100"/>
+              <w:bottom w:type="dxa" w:w="60"/>
+              <w:right w:type="dxa" w:w="100"/>
+            </w:tcMar>
+          </w:tcPr>
+          <w:p>
+            <w:pPr>
+              <w:spacing w:after="0" w:line="260"/>
+            </w:pPr>
+            <w:r>
+              <w:rPr>
+                <w:rFonts w:ascii="Arial" w:cs="Arial" w:eastAsia="Arial" w:hAnsi="Arial"/>
+                <w:sz w:val="19"/>
+                <w:szCs w:val="19"/>
+              </w:rPr>
+              <w:t xml:space="preserve">Chapters 1–27</w:t>
             </w:r>
           </w:p>
         </w:tc>

</xml_diff>

<commit_message>
Publication review round 2: free translation, framing, checklist, final task
- Ch 11 free translation taught as too literal / natural / too free
- Ch 10 equivalence types presented as a framework, not a fixed order
- Softer, context-dependent wording in Ch 20, 22, 27; subtitle
  conventions marked as conventions; classic naht examples in Ch 17
- Translation quality checklist (end of Part 8) and Put it all together
  (after Ch 27); answers headed Check your answers
- Clearer AI statement on the copyright page; reports updated (98 pages)

Co-Authored-By: Claude Opus 5.5 <noreply@anthropic.com>
Claude-Session: https://claude.ai/code/session_01VkNWz9zCVkDAANuF8jpQYy
</commit_message>
<xml_diff>
--- a/Handbook-Contributions-Report.docx
+++ b/Handbook-Contributions-Report.docx
@@ -191,7 +191,7 @@
         <w:rPr>
           <w:rFonts w:ascii="Arial" w:cs="Arial" w:eastAsia="Arial" w:hAnsi="Arial"/>
         </w:rPr>
-        <w:t xml:space="preserve">The report follows the current draft: two editions (Midnight and Light) with the same content, 96 pages, 9 parts and 27 chapters, an opening section (</w:t>
+        <w:t xml:space="preserve">The report follows the current draft: two editions (Midnight and Light) with the same content, 98 pages, 9 parts and 27 chapters, an opening section (</w:t>
       </w:r>
       <w:r>
         <w:rPr>
@@ -14650,6 +14650,136 @@
                 <w:szCs w:val="19"/>
               </w:rPr>
               <w:t xml:space="preserve">End of Part 1; before the closing section</w:t>
+            </w:r>
+          </w:p>
+        </w:tc>
+      </w:tr>
+      <w:tr>
+        <w:trPr>
+          <w:cantSplit/>
+        </w:trPr>
+        <w:tc>
+          <w:tcPr>
+            <w:tcW w:type="dxa" w:w="5624"/>
+            <w:tcBorders>
+              <w:top w:val="single" w:color="000000" w:sz="4"/>
+              <w:left w:val="single" w:color="000000" w:sz="4"/>
+              <w:bottom w:val="single" w:color="000000" w:sz="4"/>
+              <w:right w:val="single" w:color="000000" w:sz="4"/>
+            </w:tcBorders>
+            <w:tcMar>
+              <w:top w:type="dxa" w:w="60"/>
+              <w:left w:type="dxa" w:w="100"/>
+              <w:bottom w:type="dxa" w:w="60"/>
+              <w:right w:type="dxa" w:w="100"/>
+            </w:tcMar>
+          </w:tcPr>
+          <w:p>
+            <w:pPr>
+              <w:spacing w:after="0" w:line="260"/>
+            </w:pPr>
+            <w:r>
+              <w:rPr>
+                <w:rFonts w:ascii="Arial" w:cs="Arial" w:eastAsia="Arial" w:hAnsi="Arial"/>
+                <w:sz w:val="19"/>
+                <w:szCs w:val="19"/>
+              </w:rPr>
+              <w:t xml:space="preserve">Wrote a Translation quality checklist and a final task, Put it all together, which takes one short press release through every step of the book</w:t>
+            </w:r>
+          </w:p>
+        </w:tc>
+        <w:tc>
+          <w:tcPr>
+            <w:tcW w:type="dxa" w:w="3447"/>
+            <w:tcBorders>
+              <w:top w:val="single" w:color="000000" w:sz="4"/>
+              <w:left w:val="single" w:color="000000" w:sz="4"/>
+              <w:bottom w:val="single" w:color="000000" w:sz="4"/>
+              <w:right w:val="single" w:color="000000" w:sz="4"/>
+            </w:tcBorders>
+            <w:tcMar>
+              <w:top w:type="dxa" w:w="60"/>
+              <w:left w:type="dxa" w:w="100"/>
+              <w:bottom w:type="dxa" w:w="60"/>
+              <w:right w:type="dxa" w:w="100"/>
+            </w:tcMar>
+          </w:tcPr>
+          <w:p>
+            <w:pPr>
+              <w:spacing w:after="0" w:line="260"/>
+            </w:pPr>
+            <w:r>
+              <w:rPr>
+                <w:rFonts w:ascii="Arial" w:cs="Arial" w:eastAsia="Arial" w:hAnsi="Arial"/>
+                <w:sz w:val="19"/>
+                <w:szCs w:val="19"/>
+              </w:rPr>
+              <w:t xml:space="preserve">End of Part 8; after Chapter 27</w:t>
+            </w:r>
+          </w:p>
+        </w:tc>
+      </w:tr>
+      <w:tr>
+        <w:trPr>
+          <w:cantSplit/>
+        </w:trPr>
+        <w:tc>
+          <w:tcPr>
+            <w:tcW w:type="dxa" w:w="5624"/>
+            <w:tcBorders>
+              <w:top w:val="single" w:color="000000" w:sz="4"/>
+              <w:left w:val="single" w:color="000000" w:sz="4"/>
+              <w:bottom w:val="single" w:color="000000" w:sz="4"/>
+              <w:right w:val="single" w:color="000000" w:sz="4"/>
+            </w:tcBorders>
+            <w:tcMar>
+              <w:top w:type="dxa" w:w="60"/>
+              <w:left w:type="dxa" w:w="100"/>
+              <w:bottom w:type="dxa" w:w="60"/>
+              <w:right w:type="dxa" w:w="100"/>
+            </w:tcMar>
+          </w:tcPr>
+          <w:p>
+            <w:pPr>
+              <w:spacing w:after="0" w:line="260"/>
+            </w:pPr>
+            <w:r>
+              <w:rPr>
+                <w:rFonts w:ascii="Arial" w:cs="Arial" w:eastAsia="Arial" w:hAnsi="Arial"/>
+                <w:sz w:val="19"/>
+                <w:szCs w:val="19"/>
+              </w:rPr>
+              <w:t xml:space="preserve">Revised the wording of rules and claims so that they read as tendencies, not absolute laws, and marked the preferred Arabic term where two exist</w:t>
+            </w:r>
+          </w:p>
+        </w:tc>
+        <w:tc>
+          <w:tcPr>
+            <w:tcW w:type="dxa" w:w="3447"/>
+            <w:tcBorders>
+              <w:top w:val="single" w:color="000000" w:sz="4"/>
+              <w:left w:val="single" w:color="000000" w:sz="4"/>
+              <w:bottom w:val="single" w:color="000000" w:sz="4"/>
+              <w:right w:val="single" w:color="000000" w:sz="4"/>
+            </w:tcBorders>
+            <w:tcMar>
+              <w:top w:type="dxa" w:w="60"/>
+              <w:left w:type="dxa" w:w="100"/>
+              <w:bottom w:type="dxa" w:w="60"/>
+              <w:right w:type="dxa" w:w="100"/>
+            </w:tcMar>
+          </w:tcPr>
+          <w:p>
+            <w:pPr>
+              <w:spacing w:after="0" w:line="260"/>
+            </w:pPr>
+            <w:r>
+              <w:rPr>
+                <w:rFonts w:ascii="Arial" w:cs="Arial" w:eastAsia="Arial" w:hAnsi="Arial"/>
+                <w:sz w:val="19"/>
+                <w:szCs w:val="19"/>
+              </w:rPr>
+              <w:t xml:space="preserve">Chapters 4, 10, 11, 20, 22, 27; Glossary</w:t>
             </w:r>
           </w:p>
         </w:tc>

</xml_diff>

<commit_message>
Add Kuwaiti expressions from the Kuwaiti expressions dictionary
Chapter 9 Step 5 (dialect expressions translated by function), Chapter 15
(Make yourself at home) and Chapter 27 (subtitling a Kuwaiti character);
dictionary added to the References; answer label kept with its answers.

Co-Authored-By: Claude Opus 5.5 <noreply@anthropic.com>
Claude-Session: https://claude.ai/code/session_01VkNWz9zCVkDAANuF8jpQYy
</commit_message>
<xml_diff>
--- a/Handbook-Contributions-Report.docx
+++ b/Handbook-Contributions-Report.docx
@@ -1652,7 +1652,7 @@
                 <w:sz w:val="19"/>
                 <w:szCs w:val="19"/>
               </w:rPr>
-              <w:t xml:space="preserve">: three idioms</w:t>
+              <w:t xml:space="preserve">: three idioms; Kuwaiti expressions from the Kuwaiti dictionary (Loulwah’s proposal)</w:t>
             </w:r>
           </w:p>
         </w:tc>
@@ -4467,6 +4467,191 @@
                 <w:szCs w:val="19"/>
               </w:rPr>
               <w:t xml:space="preserve">Chapter 3, now in Part 1</w:t>
+            </w:r>
+          </w:p>
+        </w:tc>
+      </w:tr>
+      <w:tr>
+        <w:trPr>
+          <w:cantSplit/>
+        </w:trPr>
+        <w:tc>
+          <w:tcPr>
+            <w:tcW w:type="dxa" w:w="5624"/>
+            <w:tcBorders>
+              <w:top w:val="single" w:color="000000" w:sz="4"/>
+              <w:left w:val="single" w:color="000000" w:sz="4"/>
+              <w:bottom w:val="single" w:color="000000" w:sz="4"/>
+              <w:right w:val="single" w:color="000000" w:sz="4"/>
+            </w:tcBorders>
+            <w:tcMar>
+              <w:top w:type="dxa" w:w="60"/>
+              <w:left w:type="dxa" w:w="100"/>
+              <w:bottom w:type="dxa" w:w="60"/>
+              <w:right w:type="dxa" w:w="100"/>
+            </w:tcMar>
+          </w:tcPr>
+          <w:p>
+            <w:pPr>
+              <w:spacing w:after="0" w:line="260"/>
+            </w:pPr>
+            <w:r>
+              <w:rPr>
+                <w:rFonts w:ascii="Arial" w:cs="Arial" w:eastAsia="Arial" w:hAnsi="Arial"/>
+                <w:sz w:val="19"/>
+                <w:szCs w:val="19"/>
+              </w:rPr>
+              <w:t xml:space="preserve">Her proposal of Kuwaiti expressions from a Kuwaiti dictionary: seven expressions from </w:t>
+            </w:r>
+            <w:r>
+              <w:rPr>
+                <w:rFonts w:ascii="Arial" w:cs="Arial" w:eastAsia="Arial" w:hAnsi="Arial"/>
+                <w:i/>
+                <w:iCs/>
+                <w:sz w:val="19"/>
+                <w:szCs w:val="19"/>
+              </w:rPr>
+              <w:t xml:space="preserve">Muʿjam al-taʿābīr al-iṣṭilāḥiyya al-Kuwaytiyya al-muqārana</w:t>
+            </w:r>
+            <w:r>
+              <w:rPr>
+                <w:rFonts w:ascii="Arial" w:cs="Arial" w:eastAsia="Arial" w:hAnsi="Arial"/>
+                <w:sz w:val="19"/>
+                <w:szCs w:val="19"/>
+              </w:rPr>
+              <w:t xml:space="preserve"> (</w:t>
+            </w:r>
+            <w:r>
+              <w:rPr>
+                <w:rFonts w:ascii="Arial" w:cs="Arial" w:hAnsi="Arial"/>
+                <w:sz w:val="19"/>
+                <w:szCs w:val="20"/>
+                <w:rtl/>
+              </w:rPr>
+              <w:t xml:space="preserve">الحجي سهل</w:t>
+            </w:r>
+            <w:r>
+              <w:rPr>
+                <w:rFonts w:ascii="Arial" w:cs="Arial" w:eastAsia="Arial" w:hAnsi="Arial"/>
+                <w:sz w:val="19"/>
+                <w:szCs w:val="19"/>
+              </w:rPr>
+              <w:t xml:space="preserve">, </w:t>
+            </w:r>
+            <w:r>
+              <w:rPr>
+                <w:rFonts w:ascii="Arial" w:cs="Arial" w:hAnsi="Arial"/>
+                <w:sz w:val="19"/>
+                <w:szCs w:val="20"/>
+                <w:rtl/>
+              </w:rPr>
+              <w:t xml:space="preserve">الحجي معاك ضايع</w:t>
+            </w:r>
+            <w:r>
+              <w:rPr>
+                <w:rFonts w:ascii="Arial" w:cs="Arial" w:eastAsia="Arial" w:hAnsi="Arial"/>
+                <w:sz w:val="19"/>
+                <w:szCs w:val="19"/>
+              </w:rPr>
+              <w:t xml:space="preserve">, </w:t>
+            </w:r>
+            <w:r>
+              <w:rPr>
+                <w:rFonts w:ascii="Arial" w:cs="Arial" w:hAnsi="Arial"/>
+                <w:sz w:val="19"/>
+                <w:szCs w:val="20"/>
+                <w:rtl/>
+              </w:rPr>
+              <w:t xml:space="preserve">السالفة أكبر من جدي</w:t>
+            </w:r>
+            <w:r>
+              <w:rPr>
+                <w:rFonts w:ascii="Arial" w:cs="Arial" w:eastAsia="Arial" w:hAnsi="Arial"/>
+                <w:sz w:val="19"/>
+                <w:szCs w:val="19"/>
+              </w:rPr>
+              <w:t xml:space="preserve">, </w:t>
+            </w:r>
+            <w:r>
+              <w:rPr>
+                <w:rFonts w:ascii="Arial" w:cs="Arial" w:hAnsi="Arial"/>
+                <w:sz w:val="19"/>
+                <w:szCs w:val="20"/>
+                <w:rtl/>
+              </w:rPr>
+              <w:t xml:space="preserve">الدموع أربع أربع</w:t>
+            </w:r>
+            <w:r>
+              <w:rPr>
+                <w:rFonts w:ascii="Arial" w:cs="Arial" w:eastAsia="Arial" w:hAnsi="Arial"/>
+                <w:sz w:val="19"/>
+                <w:szCs w:val="19"/>
+              </w:rPr>
+              <w:t xml:space="preserve">, </w:t>
+            </w:r>
+            <w:r>
+              <w:rPr>
+                <w:rFonts w:ascii="Arial" w:cs="Arial" w:hAnsi="Arial"/>
+                <w:sz w:val="19"/>
+                <w:szCs w:val="20"/>
+                <w:rtl/>
+              </w:rPr>
+              <w:t xml:space="preserve">الشمس منين طالعة؟</w:t>
+            </w:r>
+            <w:r>
+              <w:rPr>
+                <w:rFonts w:ascii="Arial" w:cs="Arial" w:eastAsia="Arial" w:hAnsi="Arial"/>
+                <w:sz w:val="19"/>
+                <w:szCs w:val="19"/>
+              </w:rPr>
+              <w:t xml:space="preserve">, </w:t>
+            </w:r>
+            <w:r>
+              <w:rPr>
+                <w:rFonts w:ascii="Arial" w:cs="Arial" w:hAnsi="Arial"/>
+                <w:sz w:val="19"/>
+                <w:szCs w:val="20"/>
+                <w:rtl/>
+              </w:rPr>
+              <w:t xml:space="preserve">العين أوسع من الدار</w:t>
+            </w:r>
+            <w:r>
+              <w:rPr>
+                <w:rFonts w:ascii="Arial" w:cs="Arial" w:eastAsia="Arial" w:hAnsi="Arial"/>
+                <w:sz w:val="19"/>
+                <w:szCs w:val="19"/>
+              </w:rPr>
+              <w:t xml:space="preserve">), with their English equivalents</w:t>
+            </w:r>
+          </w:p>
+        </w:tc>
+        <w:tc>
+          <w:tcPr>
+            <w:tcW w:type="dxa" w:w="3447"/>
+            <w:tcBorders>
+              <w:top w:val="single" w:color="000000" w:sz="4"/>
+              <w:left w:val="single" w:color="000000" w:sz="4"/>
+              <w:bottom w:val="single" w:color="000000" w:sz="4"/>
+              <w:right w:val="single" w:color="000000" w:sz="4"/>
+            </w:tcBorders>
+            <w:tcMar>
+              <w:top w:type="dxa" w:w="60"/>
+              <w:left w:type="dxa" w:w="100"/>
+              <w:bottom w:type="dxa" w:w="60"/>
+              <w:right w:type="dxa" w:w="100"/>
+            </w:tcMar>
+          </w:tcPr>
+          <w:p>
+            <w:pPr>
+              <w:spacing w:after="0" w:line="260"/>
+            </w:pPr>
+            <w:r>
+              <w:rPr>
+                <w:rFonts w:ascii="Arial" w:cs="Arial" w:eastAsia="Arial" w:hAnsi="Arial"/>
+                <w:sz w:val="19"/>
+                <w:szCs w:val="19"/>
+              </w:rPr>
+              <w:t xml:space="preserve">Chapter 9, Step 5; Chapters 15 and 27</w:t>
             </w:r>
           </w:p>
         </w:tc>
@@ -5168,71 +5353,6 @@
                 <w:szCs w:val="19"/>
               </w:rPr>
               <w:t xml:space="preserve">) or were incomplete, and most equivalents are colloquial.</w:t>
-            </w:r>
-          </w:p>
-        </w:tc>
-      </w:tr>
-      <w:tr>
-        <w:trPr>
-          <w:cantSplit/>
-        </w:trPr>
-        <w:tc>
-          <w:tcPr>
-            <w:tcW w:type="dxa" w:w="4082"/>
-            <w:tcBorders>
-              <w:top w:val="single" w:color="000000" w:sz="4"/>
-              <w:left w:val="single" w:color="000000" w:sz="4"/>
-              <w:bottom w:val="single" w:color="000000" w:sz="4"/>
-              <w:right w:val="single" w:color="000000" w:sz="4"/>
-            </w:tcBorders>
-            <w:tcMar>
-              <w:top w:type="dxa" w:w="60"/>
-              <w:left w:type="dxa" w:w="100"/>
-              <w:bottom w:type="dxa" w:w="60"/>
-              <w:right w:type="dxa" w:w="100"/>
-            </w:tcMar>
-          </w:tcPr>
-          <w:p>
-            <w:pPr>
-              <w:spacing w:after="0" w:line="260"/>
-            </w:pPr>
-            <w:r>
-              <w:rPr>
-                <w:rFonts w:ascii="Arial" w:cs="Arial" w:eastAsia="Arial" w:hAnsi="Arial"/>
-                <w:sz w:val="19"/>
-                <w:szCs w:val="19"/>
-              </w:rPr>
-              <w:t xml:space="preserve">The table of Kuwaiti expressions (from her framework instructions)</w:t>
-            </w:r>
-          </w:p>
-        </w:tc>
-        <w:tc>
-          <w:tcPr>
-            <w:tcW w:type="dxa" w:w="4989"/>
-            <w:tcBorders>
-              <w:top w:val="single" w:color="000000" w:sz="4"/>
-              <w:left w:val="single" w:color="000000" w:sz="4"/>
-              <w:bottom w:val="single" w:color="000000" w:sz="4"/>
-              <w:right w:val="single" w:color="000000" w:sz="4"/>
-            </w:tcBorders>
-            <w:tcMar>
-              <w:top w:type="dxa" w:w="60"/>
-              <w:left w:type="dxa" w:w="100"/>
-              <w:bottom w:type="dxa" w:w="60"/>
-              <w:right w:type="dxa" w:w="100"/>
-            </w:tcMar>
-          </w:tcPr>
-          <w:p>
-            <w:pPr>
-              <w:spacing w:after="0" w:line="260"/>
-            </w:pPr>
-            <w:r>
-              <w:rPr>
-                <w:rFonts w:ascii="Arial" w:cs="Arial" w:eastAsia="Arial" w:hAnsi="Arial"/>
-                <w:sz w:val="19"/>
-                <w:szCs w:val="19"/>
-              </w:rPr>
-              <w:t xml:space="preserve">The handbook uses formal Arabic; the table would suit the website.</w:t>
             </w:r>
           </w:p>
         </w:tc>

</xml_diff>

<commit_message>
Clearer Try it, Arabic term fixes, cited film lines for subtitling
Co-Authored-By: Claude Opus 5.5 <noreply@anthropic.com>
Claude-Session: https://claude.ai/code/session_01VkNWz9zCVkDAANuF8jpQYy
</commit_message>
<xml_diff>
--- a/Handbook-Contributions-Report.docx
+++ b/Handbook-Contributions-Report.docx
@@ -14900,6 +14900,107 @@
                 <w:szCs w:val="19"/>
               </w:rPr>
               <w:t xml:space="preserve">Chapters 4, 10, 11, 20, 22, 27; Glossary</w:t>
+            </w:r>
+          </w:p>
+        </w:tc>
+      </w:tr>
+      <w:tr>
+        <w:trPr>
+          <w:cantSplit/>
+        </w:trPr>
+        <w:tc>
+          <w:tcPr>
+            <w:tcW w:type="dxa" w:w="5624"/>
+            <w:tcBorders>
+              <w:top w:val="single" w:color="000000" w:sz="4"/>
+              <w:left w:val="single" w:color="000000" w:sz="4"/>
+              <w:bottom w:val="single" w:color="000000" w:sz="4"/>
+              <w:right w:val="single" w:color="000000" w:sz="4"/>
+            </w:tcBorders>
+            <w:tcMar>
+              <w:top w:type="dxa" w:w="60"/>
+              <w:left w:type="dxa" w:w="100"/>
+              <w:bottom w:type="dxa" w:w="60"/>
+              <w:right w:type="dxa" w:w="100"/>
+            </w:tcMar>
+          </w:tcPr>
+          <w:p>
+            <w:pPr>
+              <w:spacing w:after="0" w:line="260"/>
+            </w:pPr>
+            <w:r>
+              <w:rPr>
+                <w:rFonts w:ascii="Arial" w:cs="Arial" w:eastAsia="Arial" w:hAnsi="Arial"/>
+                <w:sz w:val="19"/>
+                <w:szCs w:val="19"/>
+              </w:rPr>
+              <w:t xml:space="preserve">Replaced the invented subtitling lines with famous, cited film lines (</w:t>
+            </w:r>
+            <w:r>
+              <w:rPr>
+                <w:rFonts w:ascii="Arial" w:cs="Arial" w:eastAsia="Arial" w:hAnsi="Arial"/>
+                <w:i/>
+                <w:iCs/>
+                <w:sz w:val="19"/>
+                <w:szCs w:val="19"/>
+              </w:rPr>
+              <w:t xml:space="preserve">The Godfather</w:t>
+            </w:r>
+            <w:r>
+              <w:rPr>
+                <w:rFonts w:ascii="Arial" w:cs="Arial" w:eastAsia="Arial" w:hAnsi="Arial"/>
+                <w:sz w:val="19"/>
+                <w:szCs w:val="19"/>
+              </w:rPr>
+              <w:t xml:space="preserve">; </w:t>
+            </w:r>
+            <w:r>
+              <w:rPr>
+                <w:rFonts w:ascii="Arial" w:cs="Arial" w:eastAsia="Arial" w:hAnsi="Arial"/>
+                <w:i/>
+                <w:iCs/>
+                <w:sz w:val="19"/>
+                <w:szCs w:val="19"/>
+              </w:rPr>
+              <w:t xml:space="preserve">Gone with the Wind</w:t>
+            </w:r>
+            <w:r>
+              <w:rPr>
+                <w:rFonts w:ascii="Arial" w:cs="Arial" w:eastAsia="Arial" w:hAnsi="Arial"/>
+                <w:sz w:val="19"/>
+                <w:szCs w:val="19"/>
+              </w:rPr>
+              <w:t xml:space="preserve">), each explained</w:t>
+            </w:r>
+          </w:p>
+        </w:tc>
+        <w:tc>
+          <w:tcPr>
+            <w:tcW w:type="dxa" w:w="3447"/>
+            <w:tcBorders>
+              <w:top w:val="single" w:color="000000" w:sz="4"/>
+              <w:left w:val="single" w:color="000000" w:sz="4"/>
+              <w:bottom w:val="single" w:color="000000" w:sz="4"/>
+              <w:right w:val="single" w:color="000000" w:sz="4"/>
+            </w:tcBorders>
+            <w:tcMar>
+              <w:top w:type="dxa" w:w="60"/>
+              <w:left w:type="dxa" w:w="100"/>
+              <w:bottom w:type="dxa" w:w="60"/>
+              <w:right w:type="dxa" w:w="100"/>
+            </w:tcMar>
+          </w:tcPr>
+          <w:p>
+            <w:pPr>
+              <w:spacing w:after="0" w:line="260"/>
+            </w:pPr>
+            <w:r>
+              <w:rPr>
+                <w:rFonts w:ascii="Arial" w:cs="Arial" w:eastAsia="Arial" w:hAnsi="Arial"/>
+                <w:sz w:val="19"/>
+                <w:szCs w:val="19"/>
+              </w:rPr>
+              <w:t xml:space="preserve">Chapter 27</w:t>
             </w:r>
           </w:p>
         </w:tc>

</xml_diff>

<commit_message>
Contributions Report: attribute editorial additions to Shaikhah Alkhaledi
Co-Authored-By: Claude Opus 5.5 <noreply@anthropic.com>
Claude-Session: https://claude.ai/code/session_01VkNWz9zCVkDAANuF8jpQYy
</commit_message>
<xml_diff>
--- a/Handbook-Contributions-Report.docx
+++ b/Handbook-Contributions-Report.docx
@@ -893,7 +893,7 @@
                 <w:sz w:val="19"/>
                 <w:szCs w:val="19"/>
               </w:rPr>
-              <w:t xml:space="preserve">Written from published sources; </w:t>
+              <w:t xml:space="preserve">Written by Shaikhah Alkhaledi from published sources; </w:t>
             </w:r>
             <w:r>
               <w:rPr>
@@ -2029,7 +2029,7 @@
                 <w:sz w:val="19"/>
                 <w:szCs w:val="19"/>
               </w:rPr>
-              <w:t xml:space="preserve">Samiuallah (plan); written from published sources</w:t>
+              <w:t xml:space="preserve">Samiuallah (plan); written by Shaikhah Alkhaledi from published sources</w:t>
             </w:r>
           </w:p>
         </w:tc>
@@ -2832,7 +2832,7 @@
                 <w:sz w:val="19"/>
                 <w:szCs w:val="19"/>
               </w:rPr>
-              <w:t xml:space="preserve">Written from published sources</w:t>
+              <w:t xml:space="preserve">Written by Shaikhah Alkhaledi from published sources</w:t>
             </w:r>
           </w:p>
         </w:tc>
@@ -2962,7 +2962,7 @@
                 <w:sz w:val="19"/>
                 <w:szCs w:val="19"/>
               </w:rPr>
-              <w:t xml:space="preserve">22 Machine translation and AI</w:t>
+              <w:t xml:space="preserve">22 Machine translation</w:t>
             </w:r>
           </w:p>
         </w:tc>
@@ -3117,7 +3117,7 @@
                 <w:sz w:val="19"/>
                 <w:szCs w:val="19"/>
               </w:rPr>
-              <w:t xml:space="preserve">Written from published sources</w:t>
+              <w:t xml:space="preserve">Written by Shaikhah Alkhaledi from published sources</w:t>
             </w:r>
           </w:p>
         </w:tc>
@@ -3648,7 +3648,7 @@
         <w:rPr>
           <w:rFonts w:ascii="Arial" w:cs="Arial" w:eastAsia="Arial" w:hAnsi="Arial"/>
         </w:rPr>
-        <w:t xml:space="preserve">Material received: the audiovisual translation notes (Intro to AVT and AVT 2), idiom notes, and her suggestion to include dictionaries. Her Principles of Translation notes, the Gamal article and the AVT Theory file have not yet reached the editor, and her other notes were lost.</w:t>
+        <w:t xml:space="preserve">Material received: the audiovisual translation notes (Intro to AVT and AVT 2), idiom notes, and her suggestion to include dictionaries. Her Principles of Translation notes, the Gamal article and the AVT Theory file have not yet been received, and her other notes were lost.</w:t>
       </w:r>
     </w:p>
     <w:p>
@@ -5368,7 +5368,7 @@
         <w:pStyle w:val="Heading2"/>
       </w:pPr>
       <w:r>
-        <w:t xml:space="preserve">4.4 Added by the editor to her chapters</w:t>
+        <w:t xml:space="preserve">4.4 Added by Shaikhah Alkhaledi to her chapters</w:t>
       </w:r>
     </w:p>
     <w:p>
@@ -5400,7 +5400,7 @@
         <w:rPr>
           <w:rFonts w:ascii="Arial" w:cs="Arial" w:eastAsia="Arial" w:hAnsi="Arial"/>
         </w:rPr>
-        <w:t xml:space="preserve">Material received: the terminology slides (182), the terminology material selected from them with Samiuallah Mohammad, the TerminologyIdioms document, and her suggestion of an opening chapter of tips. Her Translation Texts document (180 and 386 texts) and her stylistics summary have not yet reached the editor.</w:t>
+        <w:t xml:space="preserve">Material received: the terminology slides (182), the terminology material selected from them with Samiuallah Mohammad, the TerminologyIdioms document, and her suggestion of an opening chapter of tips. Her Translation Texts document (180 and 386 texts) and her stylistics summary have not yet been received.</w:t>
       </w:r>
     </w:p>
     <w:p>
@@ -7146,7 +7146,7 @@
         <w:pStyle w:val="Heading2"/>
       </w:pPr>
       <w:r>
-        <w:t xml:space="preserve">5.4 Added by the editor to her chapter</w:t>
+        <w:t xml:space="preserve">5.4 Added by Shaikhah Alkhaledi to her chapter</w:t>
       </w:r>
     </w:p>
     <w:p>
@@ -8672,7 +8672,7 @@
                 <w:sz w:val="19"/>
                 <w:szCs w:val="19"/>
               </w:rPr>
-              <w:t xml:space="preserve">Terminology; AI and machine translation; glossary; references (empty headings)</w:t>
+              <w:t xml:space="preserve">Terminology; machine translation; glossary; references (empty headings)</w:t>
             </w:r>
           </w:p>
         </w:tc>
@@ -15100,6 +15100,621 @@
                 <w:sz w:val="19"/>
                 <w:szCs w:val="19"/>
               </w:rPr>
+              <w:t xml:space="preserve">Wrote the opening example of Start here, a real translation decision from a news report (</w:t>
+            </w:r>
+            <w:r>
+              <w:rPr>
+                <w:rFonts w:ascii="Arial" w:cs="Arial" w:eastAsia="Arial" w:hAnsi="Arial"/>
+                <w:i/>
+                <w:iCs/>
+                <w:sz w:val="19"/>
+                <w:szCs w:val="19"/>
+              </w:rPr>
+              <w:t xml:space="preserve">The government came under pressure to reconsider the decision.</w:t>
+            </w:r>
+            <w:r>
+              <w:rPr>
+                <w:rFonts w:ascii="Arial" w:cs="Arial" w:eastAsia="Arial" w:hAnsi="Arial"/>
+                <w:sz w:val="19"/>
+                <w:szCs w:val="19"/>
+              </w:rPr>
+              <w:t xml:space="preserve"> → </w:t>
+            </w:r>
+            <w:r>
+              <w:rPr>
+                <w:rFonts w:ascii="Arial" w:cs="Arial" w:hAnsi="Arial"/>
+                <w:sz w:val="19"/>
+                <w:szCs w:val="20"/>
+                <w:rtl/>
+              </w:rPr>
+              <w:t xml:space="preserve">تعرّضت الحكومة لضغوط لإعادة النظر في القرار</w:t>
+            </w:r>
+            <w:r>
+              <w:rPr>
+                <w:rFonts w:ascii="Arial" w:cs="Arial" w:eastAsia="Arial" w:hAnsi="Arial"/>
+                <w:sz w:val="19"/>
+                <w:szCs w:val="19"/>
+              </w:rPr>
+              <w:t xml:space="preserve">)</w:t>
+            </w:r>
+          </w:p>
+        </w:tc>
+        <w:tc>
+          <w:tcPr>
+            <w:tcW w:type="dxa" w:w="3447"/>
+            <w:tcBorders>
+              <w:top w:val="single" w:color="000000" w:sz="4"/>
+              <w:left w:val="single" w:color="000000" w:sz="4"/>
+              <w:bottom w:val="single" w:color="000000" w:sz="4"/>
+              <w:right w:val="single" w:color="000000" w:sz="4"/>
+            </w:tcBorders>
+            <w:tcMar>
+              <w:top w:type="dxa" w:w="60"/>
+              <w:left w:type="dxa" w:w="100"/>
+              <w:bottom w:type="dxa" w:w="60"/>
+              <w:right w:type="dxa" w:w="100"/>
+            </w:tcMar>
+          </w:tcPr>
+          <w:p>
+            <w:pPr>
+              <w:spacing w:after="0" w:line="260"/>
+            </w:pPr>
+            <w:r>
+              <w:rPr>
+                <w:rFonts w:ascii="Arial" w:cs="Arial" w:eastAsia="Arial" w:hAnsi="Arial"/>
+                <w:sz w:val="19"/>
+                <w:szCs w:val="19"/>
+              </w:rPr>
+              <w:t xml:space="preserve">Start here</w:t>
+            </w:r>
+          </w:p>
+        </w:tc>
+      </w:tr>
+      <w:tr>
+        <w:trPr>
+          <w:cantSplit/>
+        </w:trPr>
+        <w:tc>
+          <w:tcPr>
+            <w:tcW w:type="dxa" w:w="5624"/>
+            <w:tcBorders>
+              <w:top w:val="single" w:color="000000" w:sz="4"/>
+              <w:left w:val="single" w:color="000000" w:sz="4"/>
+              <w:bottom w:val="single" w:color="000000" w:sz="4"/>
+              <w:right w:val="single" w:color="000000" w:sz="4"/>
+            </w:tcBorders>
+            <w:tcMar>
+              <w:top w:type="dxa" w:w="60"/>
+              <w:left w:type="dxa" w:w="100"/>
+              <w:bottom w:type="dxa" w:w="60"/>
+              <w:right w:type="dxa" w:w="100"/>
+            </w:tcMar>
+          </w:tcPr>
+          <w:p>
+            <w:pPr>
+              <w:spacing w:after="0" w:line="260"/>
+            </w:pPr>
+            <w:r>
+              <w:rPr>
+                <w:rFonts w:ascii="Arial" w:cs="Arial" w:eastAsia="Arial" w:hAnsi="Arial"/>
+                <w:sz w:val="19"/>
+                <w:szCs w:val="19"/>
+              </w:rPr>
+              <w:t xml:space="preserve">Wrote the examples added where the team’s material had none, and replaced weak ones: for example </w:t>
+            </w:r>
+            <w:r>
+              <w:rPr>
+                <w:rFonts w:ascii="Arial" w:cs="Arial" w:eastAsia="Arial" w:hAnsi="Arial"/>
+                <w:i/>
+                <w:iCs/>
+                <w:sz w:val="19"/>
+                <w:szCs w:val="19"/>
+              </w:rPr>
+              <w:t xml:space="preserve">the White House</w:t>
+            </w:r>
+            <w:r>
+              <w:rPr>
+                <w:rFonts w:ascii="Arial" w:cs="Arial" w:eastAsia="Arial" w:hAnsi="Arial"/>
+                <w:sz w:val="19"/>
+                <w:szCs w:val="19"/>
+              </w:rPr>
+              <w:t xml:space="preserve"> → </w:t>
+            </w:r>
+            <w:r>
+              <w:rPr>
+                <w:rFonts w:ascii="Arial" w:cs="Arial" w:hAnsi="Arial"/>
+                <w:sz w:val="19"/>
+                <w:szCs w:val="20"/>
+                <w:rtl/>
+              </w:rPr>
+              <w:t xml:space="preserve">البيت الأبيض</w:t>
+            </w:r>
+            <w:r>
+              <w:rPr>
+                <w:rFonts w:ascii="Arial" w:cs="Arial" w:eastAsia="Arial" w:hAnsi="Arial"/>
+                <w:sz w:val="19"/>
+                <w:szCs w:val="19"/>
+              </w:rPr>
+              <w:t xml:space="preserve">, </w:t>
+            </w:r>
+            <w:r>
+              <w:rPr>
+                <w:rFonts w:ascii="Arial" w:cs="Arial" w:eastAsia="Arial" w:hAnsi="Arial"/>
+                <w:i/>
+                <w:iCs/>
+                <w:sz w:val="19"/>
+                <w:szCs w:val="19"/>
+              </w:rPr>
+              <w:t xml:space="preserve">You can’t miss it</w:t>
+            </w:r>
+            <w:r>
+              <w:rPr>
+                <w:rFonts w:ascii="Arial" w:cs="Arial" w:eastAsia="Arial" w:hAnsi="Arial"/>
+                <w:sz w:val="19"/>
+                <w:szCs w:val="19"/>
+              </w:rPr>
+              <w:t xml:space="preserve"> → </w:t>
+            </w:r>
+            <w:r>
+              <w:rPr>
+                <w:rFonts w:ascii="Arial" w:cs="Arial" w:hAnsi="Arial"/>
+                <w:sz w:val="19"/>
+                <w:szCs w:val="20"/>
+                <w:rtl/>
+              </w:rPr>
+              <w:t xml:space="preserve">ستجده بسهولة</w:t>
+            </w:r>
+            <w:r>
+              <w:rPr>
+                <w:rFonts w:ascii="Arial" w:cs="Arial" w:eastAsia="Arial" w:hAnsi="Arial"/>
+                <w:sz w:val="19"/>
+                <w:szCs w:val="19"/>
+              </w:rPr>
+              <w:t xml:space="preserve">, </w:t>
+            </w:r>
+            <w:r>
+              <w:rPr>
+                <w:rFonts w:ascii="Arial" w:cs="Arial" w:hAnsi="Arial"/>
+                <w:sz w:val="19"/>
+                <w:szCs w:val="20"/>
+                <w:rtl/>
+              </w:rPr>
+              <w:t xml:space="preserve">خال</w:t>
+            </w:r>
+            <w:r>
+              <w:rPr>
+                <w:rFonts w:ascii="Arial" w:cs="Arial" w:eastAsia="Arial" w:hAnsi="Arial"/>
+                <w:sz w:val="19"/>
+                <w:szCs w:val="19"/>
+              </w:rPr>
+              <w:t xml:space="preserve"> and </w:t>
+            </w:r>
+            <w:r>
+              <w:rPr>
+                <w:rFonts w:ascii="Arial" w:cs="Arial" w:hAnsi="Arial"/>
+                <w:sz w:val="19"/>
+                <w:szCs w:val="20"/>
+                <w:rtl/>
+              </w:rPr>
+              <w:t xml:space="preserve">عمّ</w:t>
+            </w:r>
+            <w:r>
+              <w:rPr>
+                <w:rFonts w:ascii="Arial" w:cs="Arial" w:eastAsia="Arial" w:hAnsi="Arial"/>
+                <w:sz w:val="19"/>
+                <w:szCs w:val="19"/>
+              </w:rPr>
+              <w:t xml:space="preserve"> → </w:t>
+            </w:r>
+            <w:r>
+              <w:rPr>
+                <w:rFonts w:ascii="Arial" w:cs="Arial" w:eastAsia="Arial" w:hAnsi="Arial"/>
+                <w:i/>
+                <w:iCs/>
+                <w:sz w:val="19"/>
+                <w:szCs w:val="19"/>
+              </w:rPr>
+              <w:t xml:space="preserve">uncle</w:t>
+            </w:r>
+            <w:r>
+              <w:rPr>
+                <w:rFonts w:ascii="Arial" w:cs="Arial" w:eastAsia="Arial" w:hAnsi="Arial"/>
+                <w:sz w:val="19"/>
+                <w:szCs w:val="19"/>
+              </w:rPr>
+              <w:t xml:space="preserve">, and three challenge questions</w:t>
+            </w:r>
+          </w:p>
+        </w:tc>
+        <w:tc>
+          <w:tcPr>
+            <w:tcW w:type="dxa" w:w="3447"/>
+            <w:tcBorders>
+              <w:top w:val="single" w:color="000000" w:sz="4"/>
+              <w:left w:val="single" w:color="000000" w:sz="4"/>
+              <w:bottom w:val="single" w:color="000000" w:sz="4"/>
+              <w:right w:val="single" w:color="000000" w:sz="4"/>
+            </w:tcBorders>
+            <w:tcMar>
+              <w:top w:type="dxa" w:w="60"/>
+              <w:left w:type="dxa" w:w="100"/>
+              <w:bottom w:type="dxa" w:w="60"/>
+              <w:right w:type="dxa" w:w="100"/>
+            </w:tcMar>
+          </w:tcPr>
+          <w:p>
+            <w:pPr>
+              <w:spacing w:after="0" w:line="260"/>
+            </w:pPr>
+            <w:r>
+              <w:rPr>
+                <w:rFonts w:ascii="Arial" w:cs="Arial" w:eastAsia="Arial" w:hAnsi="Arial"/>
+                <w:sz w:val="19"/>
+                <w:szCs w:val="19"/>
+              </w:rPr>
+              <w:t xml:space="preserve">Chapters 10, 13, 14, 15</w:t>
+            </w:r>
+          </w:p>
+        </w:tc>
+      </w:tr>
+      <w:tr>
+        <w:trPr>
+          <w:cantSplit/>
+        </w:trPr>
+        <w:tc>
+          <w:tcPr>
+            <w:tcW w:type="dxa" w:w="5624"/>
+            <w:tcBorders>
+              <w:top w:val="single" w:color="000000" w:sz="4"/>
+              <w:left w:val="single" w:color="000000" w:sz="4"/>
+              <w:bottom w:val="single" w:color="000000" w:sz="4"/>
+              <w:right w:val="single" w:color="000000" w:sz="4"/>
+            </w:tcBorders>
+            <w:tcMar>
+              <w:top w:type="dxa" w:w="60"/>
+              <w:left w:type="dxa" w:w="100"/>
+              <w:bottom w:type="dxa" w:w="60"/>
+              <w:right w:type="dxa" w:w="100"/>
+            </w:tcMar>
+          </w:tcPr>
+          <w:p>
+            <w:pPr>
+              <w:spacing w:after="0" w:line="260"/>
+            </w:pPr>
+            <w:r>
+              <w:rPr>
+                <w:rFonts w:ascii="Arial" w:cs="Arial" w:eastAsia="Arial" w:hAnsi="Arial"/>
+                <w:sz w:val="19"/>
+                <w:szCs w:val="19"/>
+              </w:rPr>
+              <w:t xml:space="preserve">Added Kuwaiti expressions, with their English equivalents, from the Kuwaiti expressions dictionary</w:t>
+            </w:r>
+          </w:p>
+        </w:tc>
+        <w:tc>
+          <w:tcPr>
+            <w:tcW w:type="dxa" w:w="3447"/>
+            <w:tcBorders>
+              <w:top w:val="single" w:color="000000" w:sz="4"/>
+              <w:left w:val="single" w:color="000000" w:sz="4"/>
+              <w:bottom w:val="single" w:color="000000" w:sz="4"/>
+              <w:right w:val="single" w:color="000000" w:sz="4"/>
+            </w:tcBorders>
+            <w:tcMar>
+              <w:top w:type="dxa" w:w="60"/>
+              <w:left w:type="dxa" w:w="100"/>
+              <w:bottom w:type="dxa" w:w="60"/>
+              <w:right w:type="dxa" w:w="100"/>
+            </w:tcMar>
+          </w:tcPr>
+          <w:p>
+            <w:pPr>
+              <w:spacing w:after="0" w:line="260"/>
+            </w:pPr>
+            <w:r>
+              <w:rPr>
+                <w:rFonts w:ascii="Arial" w:cs="Arial" w:eastAsia="Arial" w:hAnsi="Arial"/>
+                <w:sz w:val="19"/>
+                <w:szCs w:val="19"/>
+              </w:rPr>
+              <w:t xml:space="preserve">Chapters 9, 15, 27</w:t>
+            </w:r>
+          </w:p>
+        </w:tc>
+      </w:tr>
+      <w:tr>
+        <w:trPr>
+          <w:cantSplit/>
+        </w:trPr>
+        <w:tc>
+          <w:tcPr>
+            <w:tcW w:type="dxa" w:w="5624"/>
+            <w:tcBorders>
+              <w:top w:val="single" w:color="000000" w:sz="4"/>
+              <w:left w:val="single" w:color="000000" w:sz="4"/>
+              <w:bottom w:val="single" w:color="000000" w:sz="4"/>
+              <w:right w:val="single" w:color="000000" w:sz="4"/>
+            </w:tcBorders>
+            <w:tcMar>
+              <w:top w:type="dxa" w:w="60"/>
+              <w:left w:type="dxa" w:w="100"/>
+              <w:bottom w:type="dxa" w:w="60"/>
+              <w:right w:type="dxa" w:w="100"/>
+            </w:tcMar>
+          </w:tcPr>
+          <w:p>
+            <w:pPr>
+              <w:spacing w:after="0" w:line="260"/>
+            </w:pPr>
+            <w:r>
+              <w:rPr>
+                <w:rFonts w:ascii="Arial" w:cs="Arial" w:eastAsia="Arial" w:hAnsi="Arial"/>
+                <w:sz w:val="19"/>
+                <w:szCs w:val="19"/>
+              </w:rPr>
+              <w:t xml:space="preserve">Replaced the subtitling examples with famous, cited film lines, each explained</w:t>
+            </w:r>
+          </w:p>
+        </w:tc>
+        <w:tc>
+          <w:tcPr>
+            <w:tcW w:type="dxa" w:w="3447"/>
+            <w:tcBorders>
+              <w:top w:val="single" w:color="000000" w:sz="4"/>
+              <w:left w:val="single" w:color="000000" w:sz="4"/>
+              <w:bottom w:val="single" w:color="000000" w:sz="4"/>
+              <w:right w:val="single" w:color="000000" w:sz="4"/>
+            </w:tcBorders>
+            <w:tcMar>
+              <w:top w:type="dxa" w:w="60"/>
+              <w:left w:type="dxa" w:w="100"/>
+              <w:bottom w:type="dxa" w:w="60"/>
+              <w:right w:type="dxa" w:w="100"/>
+            </w:tcMar>
+          </w:tcPr>
+          <w:p>
+            <w:pPr>
+              <w:spacing w:after="0" w:line="260"/>
+            </w:pPr>
+            <w:r>
+              <w:rPr>
+                <w:rFonts w:ascii="Arial" w:cs="Arial" w:eastAsia="Arial" w:hAnsi="Arial"/>
+                <w:sz w:val="19"/>
+                <w:szCs w:val="19"/>
+              </w:rPr>
+              <w:t xml:space="preserve">Chapter 27</w:t>
+            </w:r>
+          </w:p>
+        </w:tc>
+      </w:tr>
+      <w:tr>
+        <w:trPr>
+          <w:cantSplit/>
+        </w:trPr>
+        <w:tc>
+          <w:tcPr>
+            <w:tcW w:type="dxa" w:w="5624"/>
+            <w:tcBorders>
+              <w:top w:val="single" w:color="000000" w:sz="4"/>
+              <w:left w:val="single" w:color="000000" w:sz="4"/>
+              <w:bottom w:val="single" w:color="000000" w:sz="4"/>
+              <w:right w:val="single" w:color="000000" w:sz="4"/>
+            </w:tcBorders>
+            <w:tcMar>
+              <w:top w:type="dxa" w:w="60"/>
+              <w:left w:type="dxa" w:w="100"/>
+              <w:bottom w:type="dxa" w:w="60"/>
+              <w:right w:type="dxa" w:w="100"/>
+            </w:tcMar>
+          </w:tcPr>
+          <w:p>
+            <w:pPr>
+              <w:spacing w:after="0" w:line="260"/>
+            </w:pPr>
+            <w:r>
+              <w:rPr>
+                <w:rFonts w:ascii="Arial" w:cs="Arial" w:eastAsia="Arial" w:hAnsi="Arial"/>
+                <w:sz w:val="19"/>
+                <w:szCs w:val="19"/>
+              </w:rPr>
+              <w:t xml:space="preserve">Corrected Arabic terms: Genre → </w:t>
+            </w:r>
+            <w:r>
+              <w:rPr>
+                <w:rFonts w:ascii="Arial" w:cs="Arial" w:hAnsi="Arial"/>
+                <w:sz w:val="19"/>
+                <w:szCs w:val="20"/>
+                <w:rtl/>
+              </w:rPr>
+              <w:t xml:space="preserve">نوع النص</w:t>
+            </w:r>
+            <w:r>
+              <w:rPr>
+                <w:rFonts w:ascii="Arial" w:cs="Arial" w:eastAsia="Arial" w:hAnsi="Arial"/>
+                <w:sz w:val="19"/>
+                <w:szCs w:val="19"/>
+              </w:rPr>
+              <w:t xml:space="preserve">; Ideology → </w:t>
+            </w:r>
+            <w:r>
+              <w:rPr>
+                <w:rFonts w:ascii="Arial" w:cs="Arial" w:hAnsi="Arial"/>
+                <w:sz w:val="19"/>
+                <w:szCs w:val="20"/>
+                <w:rtl/>
+              </w:rPr>
+              <w:t xml:space="preserve">المنظومة الفكرية (الأيديولوجيا)</w:t>
+            </w:r>
+            <w:r>
+              <w:rPr>
+                <w:rFonts w:ascii="Arial" w:cs="Arial" w:eastAsia="Arial" w:hAnsi="Arial"/>
+                <w:sz w:val="19"/>
+                <w:szCs w:val="19"/>
+              </w:rPr>
+              <w:t xml:space="preserve">; Loaded word → </w:t>
+            </w:r>
+            <w:r>
+              <w:rPr>
+                <w:rFonts w:ascii="Arial" w:cs="Arial" w:hAnsi="Arial"/>
+                <w:sz w:val="19"/>
+                <w:szCs w:val="20"/>
+                <w:rtl/>
+              </w:rPr>
+              <w:t xml:space="preserve">كلمة مشحونة دلالياً</w:t>
+            </w:r>
+            <w:r>
+              <w:rPr>
+                <w:rFonts w:ascii="Arial" w:cs="Arial" w:eastAsia="Arial" w:hAnsi="Arial"/>
+                <w:sz w:val="19"/>
+                <w:szCs w:val="19"/>
+              </w:rPr>
+              <w:t xml:space="preserve">; two equivalents joined with </w:t>
+            </w:r>
+            <w:r>
+              <w:rPr>
+                <w:rFonts w:ascii="Arial" w:cs="Arial" w:hAnsi="Arial"/>
+                <w:sz w:val="19"/>
+                <w:szCs w:val="20"/>
+                <w:rtl/>
+              </w:rPr>
+              <w:t xml:space="preserve">أو</w:t>
+            </w:r>
+            <w:r>
+              <w:rPr>
+                <w:rFonts w:ascii="Arial" w:cs="Arial" w:eastAsia="Arial" w:hAnsi="Arial"/>
+                <w:sz w:val="19"/>
+                <w:szCs w:val="19"/>
+              </w:rPr>
+              <w:t xml:space="preserve">, the preferred one first</w:t>
+            </w:r>
+          </w:p>
+        </w:tc>
+        <w:tc>
+          <w:tcPr>
+            <w:tcW w:type="dxa" w:w="3447"/>
+            <w:tcBorders>
+              <w:top w:val="single" w:color="000000" w:sz="4"/>
+              <w:left w:val="single" w:color="000000" w:sz="4"/>
+              <w:bottom w:val="single" w:color="000000" w:sz="4"/>
+              <w:right w:val="single" w:color="000000" w:sz="4"/>
+            </w:tcBorders>
+            <w:tcMar>
+              <w:top w:type="dxa" w:w="60"/>
+              <w:left w:type="dxa" w:w="100"/>
+              <w:bottom w:type="dxa" w:w="60"/>
+              <w:right w:type="dxa" w:w="100"/>
+            </w:tcMar>
+          </w:tcPr>
+          <w:p>
+            <w:pPr>
+              <w:spacing w:after="0" w:line="260"/>
+            </w:pPr>
+            <w:r>
+              <w:rPr>
+                <w:rFonts w:ascii="Arial" w:cs="Arial" w:eastAsia="Arial" w:hAnsi="Arial"/>
+                <w:sz w:val="19"/>
+                <w:szCs w:val="19"/>
+              </w:rPr>
+              <w:t xml:space="preserve">Chapters 19, 20; Glossary</w:t>
+            </w:r>
+          </w:p>
+        </w:tc>
+      </w:tr>
+      <w:tr>
+        <w:trPr>
+          <w:cantSplit/>
+        </w:trPr>
+        <w:tc>
+          <w:tcPr>
+            <w:tcW w:type="dxa" w:w="5624"/>
+            <w:tcBorders>
+              <w:top w:val="single" w:color="000000" w:sz="4"/>
+              <w:left w:val="single" w:color="000000" w:sz="4"/>
+              <w:bottom w:val="single" w:color="000000" w:sz="4"/>
+              <w:right w:val="single" w:color="000000" w:sz="4"/>
+            </w:tcBorders>
+            <w:tcMar>
+              <w:top w:type="dxa" w:w="60"/>
+              <w:left w:type="dxa" w:w="100"/>
+              <w:bottom w:type="dxa" w:w="60"/>
+              <w:right w:type="dxa" w:w="100"/>
+            </w:tcMar>
+          </w:tcPr>
+          <w:p>
+            <w:pPr>
+              <w:spacing w:after="0" w:line="260"/>
+            </w:pPr>
+            <w:r>
+              <w:rPr>
+                <w:rFonts w:ascii="Arial" w:cs="Arial" w:eastAsia="Arial" w:hAnsi="Arial"/>
+                <w:sz w:val="19"/>
+                <w:szCs w:val="19"/>
+              </w:rPr>
+              <w:t xml:space="preserve">Made every Try it clearer: a line explaining its purpose, questions that name the skill, and answers that explain why</w:t>
+            </w:r>
+          </w:p>
+        </w:tc>
+        <w:tc>
+          <w:tcPr>
+            <w:tcW w:type="dxa" w:w="3447"/>
+            <w:tcBorders>
+              <w:top w:val="single" w:color="000000" w:sz="4"/>
+              <w:left w:val="single" w:color="000000" w:sz="4"/>
+              <w:bottom w:val="single" w:color="000000" w:sz="4"/>
+              <w:right w:val="single" w:color="000000" w:sz="4"/>
+            </w:tcBorders>
+            <w:tcMar>
+              <w:top w:type="dxa" w:w="60"/>
+              <w:left w:type="dxa" w:w="100"/>
+              <w:bottom w:type="dxa" w:w="60"/>
+              <w:right w:type="dxa" w:w="100"/>
+            </w:tcMar>
+          </w:tcPr>
+          <w:p>
+            <w:pPr>
+              <w:spacing w:after="0" w:line="260"/>
+            </w:pPr>
+            <w:r>
+              <w:rPr>
+                <w:rFonts w:ascii="Arial" w:cs="Arial" w:eastAsia="Arial" w:hAnsi="Arial"/>
+                <w:sz w:val="19"/>
+                <w:szCs w:val="19"/>
+              </w:rPr>
+              <w:t xml:space="preserve">Every chapter</w:t>
+            </w:r>
+          </w:p>
+        </w:tc>
+      </w:tr>
+      <w:tr>
+        <w:trPr>
+          <w:cantSplit/>
+        </w:trPr>
+        <w:tc>
+          <w:tcPr>
+            <w:tcW w:type="dxa" w:w="5624"/>
+            <w:tcBorders>
+              <w:top w:val="single" w:color="000000" w:sz="4"/>
+              <w:left w:val="single" w:color="000000" w:sz="4"/>
+              <w:bottom w:val="single" w:color="000000" w:sz="4"/>
+              <w:right w:val="single" w:color="000000" w:sz="4"/>
+            </w:tcBorders>
+            <w:tcMar>
+              <w:top w:type="dxa" w:w="60"/>
+              <w:left w:type="dxa" w:w="100"/>
+              <w:bottom w:type="dxa" w:w="60"/>
+              <w:right w:type="dxa" w:w="100"/>
+            </w:tcMar>
+          </w:tcPr>
+          <w:p>
+            <w:pPr>
+              <w:spacing w:after="0" w:line="260"/>
+            </w:pPr>
+            <w:r>
+              <w:rPr>
+                <w:rFonts w:ascii="Arial" w:cs="Arial" w:eastAsia="Arial" w:hAnsi="Arial"/>
+                <w:sz w:val="19"/>
+                <w:szCs w:val="19"/>
+              </w:rPr>
               <w:t xml:space="preserve">Designed the two covers (Midnight and Light), the page layout and the QR code; designed and developed the Translation Team’s website</w:t>
             </w:r>
           </w:p>
@@ -16153,7 +16768,7 @@
           <w:rFonts w:ascii="Arial" w:cs="Arial" w:eastAsia="Arial" w:hAnsi="Arial"/>
           <w:color w:val="C00000"/>
         </w:rPr>
-        <w:t xml:space="preserve">The order and titles on the Contributors page: the framework agreed that all four names appear equally.</w:t>
+        <w:t xml:space="preserve">The Contributors list for the final version: the framework agreed that all four names appear equally.</w:t>
       </w:r>
     </w:p>
     <w:p>

</xml_diff>

<commit_message>
Use the correct spelling of the name: Shaikha Alkhaldi
Co-Authored-By: Claude Sonnet 5.5 <noreply@anthropic.com>
Claude-Session: https://claude.ai/code/session_01VkNWz9zCVkDAANuF8jpQYy
</commit_message>
<xml_diff>
--- a/Handbook-Contributions-Report.docx
+++ b/Handbook-Contributions-Report.docx
@@ -74,7 +74,7 @@
           <w:sz w:val="22"/>
           <w:szCs w:val="22"/>
         </w:rPr>
-        <w:t xml:space="preserve">Prepared by Shaikhah Alkhaledi</w:t>
+        <w:t xml:space="preserve">Prepared by Shaikha Alkhaldi</w:t>
       </w:r>
     </w:p>
     <w:p>
@@ -145,7 +145,7 @@
         <w:rPr>
           <w:rFonts w:ascii="Arial" w:cs="Arial" w:eastAsia="Arial" w:hAnsi="Arial"/>
         </w:rPr>
-        <w:t xml:space="preserve">This working report explains how each team member’s material was used in the draft handbook: what was taken, what was edited, what was left out, and why. Section 7 lists the work done on the handbook itself, under the name of Shaikhah Alkhaledi.</w:t>
+        <w:t xml:space="preserve">This working report explains how each team member’s material was used in the draft handbook: what was taken, what was edited, what was left out, and why. Section 7 lists the work done on the handbook itself, under the name of Shaikha Alkhaldi.</w:t>
       </w:r>
     </w:p>
     <w:p>
@@ -592,7 +592,7 @@
                 <w:sz w:val="19"/>
                 <w:szCs w:val="19"/>
               </w:rPr>
-              <w:t xml:space="preserve">Written by Shaikhah Alkhaledi</w:t>
+              <w:t xml:space="preserve">Written by Shaikha Alkhaldi</w:t>
             </w:r>
           </w:p>
         </w:tc>
@@ -735,7 +735,7 @@
                 <w:sz w:val="19"/>
                 <w:szCs w:val="19"/>
               </w:rPr>
-              <w:t xml:space="preserve">Shaikhah’s notes: three kinds of translation, the translator as a reader; the Rosetta Stone</w:t>
+              <w:t xml:space="preserve">Shaikha’s notes: three kinds of translation, the translator as a reader; the Rosetta Stone</w:t>
             </w:r>
           </w:p>
         </w:tc>
@@ -830,7 +830,7 @@
                 <w:sz w:val="19"/>
                 <w:szCs w:val="19"/>
               </w:rPr>
-              <w:t xml:space="preserve">Shaikhah’s framework: the three questions (client, purpose, audience); a worked first translation</w:t>
+              <w:t xml:space="preserve">Shaikha’s framework: the three questions (client, purpose, audience); a worked first translation</w:t>
             </w:r>
           </w:p>
         </w:tc>
@@ -925,7 +925,7 @@
                 <w:sz w:val="19"/>
                 <w:szCs w:val="19"/>
               </w:rPr>
-              <w:t xml:space="preserve">Written by Shaikhah Alkhaledi from published sources; </w:t>
+              <w:t xml:space="preserve">Written by Shaikha Alkhaldi from published sources; </w:t>
             </w:r>
             <w:r>
               <w:rPr>
@@ -1029,7 +1029,7 @@
                 <w:sz w:val="19"/>
                 <w:szCs w:val="19"/>
               </w:rPr>
-              <w:t xml:space="preserve">Shaikhah’s notes: </w:t>
+              <w:t xml:space="preserve">Shaikha’s notes: </w:t>
             </w:r>
             <w:r>
               <w:rPr>
@@ -1309,7 +1309,7 @@
                 <w:sz w:val="19"/>
                 <w:szCs w:val="19"/>
               </w:rPr>
-              <w:t xml:space="preserve">Shaikhah’s notes: lexical gaps, false equivalents, rare words</w:t>
+              <w:t xml:space="preserve">Shaikha’s notes: lexical gaps, false equivalents, rare words</w:t>
             </w:r>
           </w:p>
         </w:tc>
@@ -1404,7 +1404,7 @@
                 <w:sz w:val="19"/>
                 <w:szCs w:val="19"/>
               </w:rPr>
-              <w:t xml:space="preserve">Shaikhah’s notes: </w:t>
+              <w:t xml:space="preserve">Shaikha’s notes: </w:t>
             </w:r>
             <w:r>
               <w:rPr>
@@ -1526,7 +1526,7 @@
                 <w:sz w:val="19"/>
                 <w:szCs w:val="19"/>
               </w:rPr>
-              <w:t xml:space="preserve">Shaikhah’s notes: </w:t>
+              <w:t xml:space="preserve">Shaikha’s notes: </w:t>
             </w:r>
             <w:r>
               <w:rPr>
@@ -1684,7 +1684,7 @@
                 <w:sz w:val="19"/>
                 <w:szCs w:val="19"/>
               </w:rPr>
-              <w:t xml:space="preserve">Shaikhah’s notes: fixed expressions, spotting idioms, five ways to translate them; 180 notes and </w:t>
+              <w:t xml:space="preserve">Shaikha’s notes: fixed expressions, spotting idioms, five ways to translate them; 180 notes and </w:t>
             </w:r>
             <w:r>
               <w:rPr>
@@ -2078,7 +2078,7 @@
                 <w:sz w:val="19"/>
                 <w:szCs w:val="19"/>
               </w:rPr>
-              <w:t xml:space="preserve">Samiuallah (plan); written by Shaikhah Alkhaledi from published sources</w:t>
+              <w:t xml:space="preserve">Samiuallah (plan); written by Shaikha Alkhaldi from published sources</w:t>
             </w:r>
           </w:p>
         </w:tc>
@@ -2267,7 +2267,7 @@
                 <w:sz w:val="19"/>
                 <w:szCs w:val="19"/>
               </w:rPr>
-              <w:t xml:space="preserve">Explicitation and implicitation (Teams chat); further strategies; Shaikhah’s notes: Arabic words in English</w:t>
+              <w:t xml:space="preserve">Explicitation and implicitation (Teams chat); further strategies; Shaikha’s notes: Arabic words in English</w:t>
             </w:r>
           </w:p>
         </w:tc>
@@ -2552,7 +2552,7 @@
                 <w:sz w:val="19"/>
                 <w:szCs w:val="19"/>
               </w:rPr>
-              <w:t xml:space="preserve">Shaikhah’s notes: Arabicisation examples; Masooma’s slides: </w:t>
+              <w:t xml:space="preserve">Shaikha’s notes: Arabicisation examples; Masooma’s slides: </w:t>
             </w:r>
             <w:r>
               <w:rPr>
@@ -2756,7 +2756,7 @@
                 <w:sz w:val="19"/>
                 <w:szCs w:val="19"/>
               </w:rPr>
-              <w:t xml:space="preserve">Samiuallah (plan); Shaikhah (framework)</w:t>
+              <w:t xml:space="preserve">Samiuallah (plan); Shaikha (framework)</w:t>
             </w:r>
           </w:p>
         </w:tc>
@@ -2786,7 +2786,7 @@
                 <w:sz w:val="19"/>
                 <w:szCs w:val="19"/>
               </w:rPr>
-              <w:t xml:space="preserve">Shaikhah’s notes: news headlines, the inverted pyramid, technical and literary texts</w:t>
+              <w:t xml:space="preserve">Shaikha’s notes: news headlines, the inverted pyramid, technical and literary texts</w:t>
             </w:r>
           </w:p>
         </w:tc>
@@ -2899,7 +2899,7 @@
                 <w:sz w:val="19"/>
                 <w:szCs w:val="19"/>
               </w:rPr>
-              <w:t xml:space="preserve">Written by Shaikhah Alkhaledi from published sources</w:t>
+              <w:t xml:space="preserve">Written by Shaikha Alkhaldi from published sources</w:t>
             </w:r>
           </w:p>
         </w:tc>
@@ -2994,7 +2994,7 @@
                 <w:sz w:val="19"/>
                 <w:szCs w:val="19"/>
               </w:rPr>
-              <w:t xml:space="preserve">Shaikhah’s terminology class notes: the research steps; Shaikhah’s notes: medical examples; UNTERM, Arabterm, a sample term list; the Damascus academy</w:t>
+              <w:t xml:space="preserve">Shaikha’s terminology class notes: the research steps; Shaikha’s notes: medical examples; UNTERM, Arabterm, a sample term list; the Damascus academy</w:t>
             </w:r>
           </w:p>
         </w:tc>
@@ -3089,7 +3089,7 @@
                 <w:sz w:val="19"/>
                 <w:szCs w:val="19"/>
               </w:rPr>
-              <w:t xml:space="preserve">Shaikhah’s notes: translation memory, CAT tools, localisation; the 1954 demonstration</w:t>
+              <w:t xml:space="preserve">Shaikha’s notes: translation memory, CAT tools, localisation; the 1954 demonstration</w:t>
             </w:r>
           </w:p>
         </w:tc>
@@ -3154,7 +3154,7 @@
                 <w:sz w:val="19"/>
                 <w:szCs w:val="19"/>
               </w:rPr>
-              <w:t xml:space="preserve">Masooma (idea); Samiuallah (plan); Shaikhah (framework)</w:t>
+              <w:t xml:space="preserve">Masooma (idea); Samiuallah (plan); Shaikha (framework)</w:t>
             </w:r>
           </w:p>
         </w:tc>
@@ -3184,7 +3184,7 @@
                 <w:sz w:val="19"/>
                 <w:szCs w:val="19"/>
               </w:rPr>
-              <w:t xml:space="preserve">Written by Shaikhah Alkhaledi from published sources</w:t>
+              <w:t xml:space="preserve">Written by Shaikha Alkhaldi from published sources</w:t>
             </w:r>
           </w:p>
         </w:tc>
@@ -3249,7 +3249,7 @@
                 <w:sz w:val="19"/>
                 <w:szCs w:val="19"/>
               </w:rPr>
-              <w:t xml:space="preserve">Shaikhah (framework)</w:t>
+              <w:t xml:space="preserve">Shaikha (framework)</w:t>
             </w:r>
           </w:p>
         </w:tc>
@@ -3479,7 +3479,7 @@
                 <w:sz w:val="19"/>
                 <w:szCs w:val="19"/>
               </w:rPr>
-              <w:t xml:space="preserve">Shaikhah’s notes: the Arabic dubbing of </w:t>
+              <w:t xml:space="preserve">Shaikha’s notes: the Arabic dubbing of </w:t>
             </w:r>
             <w:r>
               <w:rPr>
@@ -3657,7 +3657,7 @@
                 <w:sz w:val="19"/>
                 <w:szCs w:val="19"/>
               </w:rPr>
-              <w:t xml:space="preserve">Written by Shaikhah Alkhaledi</w:t>
+              <w:t xml:space="preserve">Written by Shaikha Alkhaldi</w:t>
             </w:r>
           </w:p>
         </w:tc>
@@ -6275,7 +6275,7 @@
         <w:pStyle w:val="Heading2"/>
       </w:pPr>
       <w:r>
-        <w:t xml:space="preserve">4.5 Added by Shaikhah Alkhaledi to her chapters</w:t>
+        <w:t xml:space="preserve">4.5 Added by Shaikha Alkhaldi to her chapters</w:t>
       </w:r>
     </w:p>
     <w:p>
@@ -9372,7 +9372,7 @@
         <w:pStyle w:val="Heading2"/>
       </w:pPr>
       <w:r>
-        <w:t xml:space="preserve">5.5 Added by Shaikhah Alkhaledi to her chapter</w:t>
+        <w:t xml:space="preserve">5.5 Added by Shaikha Alkhaldi to her chapter</w:t>
       </w:r>
     </w:p>
     <w:p>
@@ -9426,7 +9426,7 @@
         <w:rPr>
           <w:rFonts w:ascii="Arial" w:cs="Arial" w:eastAsia="Arial" w:hAnsi="Arial"/>
         </w:rPr>
-        <w:t xml:space="preserve">), the research steps from Shaikhah Alkhaledi’s terminology class notes (see Section 7), and the Damascus academy and the Coordination Bureau of Arabization in Rabat.</w:t>
+        <w:t xml:space="preserve">), the research steps from Shaikha Alkhaldi’s terminology class notes (see Section 7), and the Damascus academy and the Coordination Bureau of Arabization in Rabat.</w:t>
       </w:r>
     </w:p>
     <w:p>
@@ -14457,7 +14457,7 @@
         <w:pStyle w:val="Heading1"/>
       </w:pPr>
       <w:r>
-        <w:t xml:space="preserve">7. Shaikhah Alkhaledi</w:t>
+        <w:t xml:space="preserve">7. Shaikha Alkhaldi</w:t>
       </w:r>
     </w:p>
     <w:p>
@@ -14469,7 +14469,7 @@
         <w:rPr>
           <w:rFonts w:ascii="Arial" w:cs="Arial" w:eastAsia="Arial" w:hAnsi="Arial"/>
         </w:rPr>
-        <w:t xml:space="preserve">This section lists the work done on the handbook by Shaikhah Alkhaledi, with the place in the book where each piece can be found and the reason for it. It covers her own material, the structure of the book, the sections written for it, the examples, the checking, and the design.</w:t>
+        <w:t xml:space="preserve">This section lists the work done on the handbook by Shaikha Alkhaldi, with the place in the book where each piece can be found and the reason for it. It covers her own material, the structure of the book, the sections written for it, the examples, the checking, and the design.</w:t>
       </w:r>
     </w:p>
     <w:p>

</xml_diff>

<commit_message>
Contributions Report: remove three decided points; keep Section 8 table together
Co-Authored-By: Claude Sonnet 5.5 <noreply@anthropic.com>
Claude-Session: https://claude.ai/code/session_01VkNWz9zCVkDAANuF8jpQYy
</commit_message>
<xml_diff>
--- a/Handbook-Contributions-Report.docx
+++ b/Handbook-Contributions-Report.docx
@@ -22234,6 +22234,7 @@
     <w:p>
       <w:pPr>
         <w:pStyle w:val="Heading1"/>
+        <w:pageBreakBefore/>
       </w:pPr>
       <w:r>
         <w:t xml:space="preserve">8. Removed from the whole draft, and why</w:t>
@@ -22933,57 +22934,6 @@
           <w:rFonts w:ascii="Arial" w:cs="Arial" w:eastAsia="Arial" w:hAnsi="Arial"/>
         </w:rPr>
         <w:t xml:space="preserve">Because this is a draft, the following need the team’s decision:</w:t>
-      </w:r>
-    </w:p>
-    <w:p>
-      <w:pPr>
-        <w:pStyle w:val="ListParagraph"/>
-        <w:numPr>
-          <w:ilvl w:val="0"/>
-          <w:numId w:val="2"/>
-        </w:numPr>
-        <w:spacing w:after="80" w:line="290"/>
-      </w:pPr>
-      <w:r>
-        <w:rPr>
-          <w:rFonts w:ascii="Arial" w:cs="Arial" w:eastAsia="Arial" w:hAnsi="Arial"/>
-          <w:color w:val="C00000"/>
-        </w:rPr>
-        <w:t xml:space="preserve">The Contributors list for the final version: the framework agreed that all four names appear equally.</w:t>
-      </w:r>
-    </w:p>
-    <w:p>
-      <w:pPr>
-        <w:pStyle w:val="ListParagraph"/>
-        <w:numPr>
-          <w:ilvl w:val="0"/>
-          <w:numId w:val="2"/>
-        </w:numPr>
-        <w:spacing w:after="80" w:line="290"/>
-      </w:pPr>
-      <w:r>
-        <w:rPr>
-          <w:rFonts w:ascii="Arial" w:cs="Arial" w:eastAsia="Arial" w:hAnsi="Arial"/>
-          <w:color w:val="C00000"/>
-        </w:rPr>
-        <w:t xml:space="preserve">Whether to name the academic supervisor, Abdullah Bezea, in the handbook.</w:t>
-      </w:r>
-    </w:p>
-    <w:p>
-      <w:pPr>
-        <w:pStyle w:val="ListParagraph"/>
-        <w:numPr>
-          <w:ilvl w:val="0"/>
-          <w:numId w:val="2"/>
-        </w:numPr>
-        <w:spacing w:after="80" w:line="290"/>
-      </w:pPr>
-      <w:r>
-        <w:rPr>
-          <w:rFonts w:ascii="Arial" w:cs="Arial" w:eastAsia="Arial" w:hAnsi="Arial"/>
-          <w:color w:val="C00000"/>
-        </w:rPr>
-        <w:t xml:space="preserve">The club’s official name: the draft says “Guild Professional Club”; the team’s main document says “The Professional English Club: Guild”.</w:t>
       </w:r>
     </w:p>
     <w:p>

</xml_diff>

<commit_message>
Cite Dr. Mohammed bin Nasser for Kuwaiti expressions; remove open-items section; mark working title
Co-Authored-By: Claude Sonnet 5.5 <noreply@anthropic.com>
Claude-Session: https://claude.ai/code/session_01VkNWz9zCVkDAANuF8jpQYy
</commit_message>
<xml_diff>
--- a/Handbook-Contributions-Report.docx
+++ b/Handbook-Contributions-Report.docx
@@ -46,7 +46,7 @@
           <w:sz w:val="30"/>
           <w:szCs w:val="30"/>
         </w:rPr>
-        <w:t xml:space="preserve">)</w:t>
+        <w:t xml:space="preserve">): working title</w:t>
       </w:r>
     </w:p>
     <w:p>
@@ -220,6 +220,22 @@
           <w:rFonts w:ascii="Arial" w:cs="Arial" w:eastAsia="Arial" w:hAnsi="Arial"/>
         </w:rPr>
         <w:t xml:space="preserve">).</w:t>
+      </w:r>
+    </w:p>
+    <w:p>
+      <w:pPr>
+        <w:pStyle w:val="ListParagraph"/>
+        <w:numPr>
+          <w:ilvl w:val="0"/>
+          <w:numId w:val="2"/>
+        </w:numPr>
+        <w:spacing w:after="80" w:line="290"/>
+      </w:pPr>
+      <w:r>
+        <w:rPr>
+          <w:rFonts w:ascii="Arial" w:cs="Arial" w:eastAsia="Arial" w:hAnsi="Arial"/>
+        </w:rPr>
+        <w:t xml:space="preserve">The book’s title has not been decided yet. “Translation Handbook” is a working title.</w:t>
       </w:r>
     </w:p>
     <w:p>
@@ -1701,7 +1717,7 @@
                 <w:sz w:val="19"/>
                 <w:szCs w:val="19"/>
               </w:rPr>
-              <w:t xml:space="preserve">: three idioms; Kuwaiti expressions from the Kuwaiti dictionary (Loulwah’s proposal)</w:t>
+              <w:t xml:space="preserve">: three idioms; six Kuwaiti expressions selected from Dr. Mohammed bin Nasser’s dictionary (letter alif)</w:t>
             </w:r>
           </w:p>
         </w:tc>
@@ -3783,7 +3799,7 @@
         <w:rPr>
           <w:rFonts w:ascii="Arial" w:cs="Arial" w:eastAsia="Arial" w:hAnsi="Arial"/>
         </w:rPr>
-        <w:t xml:space="preserve">Idiom notes: 18 English idioms, most with a Kuwaiti equivalent.</w:t>
+        <w:t xml:space="preserve">Idiom notes: 18 English idioms, most with a colloquial equivalent.</w:t>
       </w:r>
     </w:p>
     <w:p>
@@ -3799,7 +3815,7 @@
         <w:rPr>
           <w:rFonts w:ascii="Arial" w:cs="Arial" w:eastAsia="Arial" w:hAnsi="Arial"/>
         </w:rPr>
-        <w:t xml:space="preserve">Proposals for the framework: digital tools, machine translation, Kuwaiti expressions, and examples.</w:t>
+        <w:t xml:space="preserve">Proposals for the framework: digital tools, machine translation, and examples.</w:t>
       </w:r>
     </w:p>
     <w:p>
@@ -4944,97 +4960,6 @@
                 <w:sz w:val="19"/>
                 <w:szCs w:val="19"/>
               </w:rPr>
-              <w:t xml:space="preserve">Six Kuwaiti expressions from her Kuwaiti dictionary, such as </w:t>
-            </w:r>
-            <w:r>
-              <w:rPr>
-                <w:rFonts w:ascii="Arial" w:cs="Arial" w:hAnsi="Arial"/>
-                <w:sz w:val="19"/>
-                <w:szCs w:val="20"/>
-                <w:rtl/>
-              </w:rPr>
-              <w:t xml:space="preserve">الحجي سهل</w:t>
-            </w:r>
-            <w:r>
-              <w:rPr>
-                <w:rFonts w:ascii="Arial" w:cs="Arial" w:eastAsia="Arial" w:hAnsi="Arial"/>
-                <w:sz w:val="19"/>
-                <w:szCs w:val="19"/>
-              </w:rPr>
-              <w:t xml:space="preserve"> and </w:t>
-            </w:r>
-            <w:r>
-              <w:rPr>
-                <w:rFonts w:ascii="Arial" w:cs="Arial" w:hAnsi="Arial"/>
-                <w:sz w:val="19"/>
-                <w:szCs w:val="20"/>
-                <w:rtl/>
-              </w:rPr>
-              <w:t xml:space="preserve">العين أوسع من الدار</w:t>
-            </w:r>
-          </w:p>
-        </w:tc>
-        <w:tc>
-          <w:tcPr>
-            <w:tcW w:type="dxa" w:w="3810"/>
-            <w:tcBorders>
-              <w:top w:val="single" w:color="000000" w:sz="4"/>
-              <w:left w:val="single" w:color="000000" w:sz="4"/>
-              <w:bottom w:val="single" w:color="000000" w:sz="4"/>
-              <w:right w:val="single" w:color="000000" w:sz="4"/>
-            </w:tcBorders>
-            <w:tcMar>
-              <w:top w:type="dxa" w:w="60"/>
-              <w:left w:type="dxa" w:w="100"/>
-              <w:bottom w:type="dxa" w:w="60"/>
-              <w:right w:type="dxa" w:w="100"/>
-            </w:tcMar>
-          </w:tcPr>
-          <w:p>
-            <w:pPr>
-              <w:spacing w:after="0" w:line="260"/>
-            </w:pPr>
-            <w:r>
-              <w:rPr>
-                <w:rFonts w:ascii="Arial" w:cs="Arial" w:eastAsia="Arial" w:hAnsi="Arial"/>
-                <w:sz w:val="19"/>
-                <w:szCs w:val="19"/>
-              </w:rPr>
-              <w:t xml:space="preserve">Chapter 9, Step 5; Chapter 15, Step 1; Chapter 27, Step 3</w:t>
-            </w:r>
-          </w:p>
-        </w:tc>
-      </w:tr>
-      <w:tr>
-        <w:trPr>
-          <w:cantSplit/>
-        </w:trPr>
-        <w:tc>
-          <w:tcPr>
-            <w:tcW w:type="dxa" w:w="5261"/>
-            <w:tcBorders>
-              <w:top w:val="single" w:color="000000" w:sz="4"/>
-              <w:left w:val="single" w:color="000000" w:sz="4"/>
-              <w:bottom w:val="single" w:color="000000" w:sz="4"/>
-              <w:right w:val="single" w:color="000000" w:sz="4"/>
-            </w:tcBorders>
-            <w:tcMar>
-              <w:top w:type="dxa" w:w="60"/>
-              <w:left w:type="dxa" w:w="100"/>
-              <w:bottom w:type="dxa" w:w="60"/>
-              <w:right w:type="dxa" w:w="100"/>
-            </w:tcMar>
-          </w:tcPr>
-          <w:p>
-            <w:pPr>
-              <w:spacing w:after="0" w:line="260"/>
-            </w:pPr>
-            <w:r>
-              <w:rPr>
-                <w:rFonts w:ascii="Arial" w:cs="Arial" w:eastAsia="Arial" w:hAnsi="Arial"/>
-                <w:sz w:val="19"/>
-                <w:szCs w:val="19"/>
-              </w:rPr>
               <w:t xml:space="preserve">Her proposal for a section on digital tools and machine translation: when a machine helps, typical mistakes, post-editing, safety rules</w:t>
             </w:r>
           </w:p>
@@ -5452,44 +5377,6 @@
           <w:rFonts w:ascii="Arial" w:cs="Arial" w:eastAsia="Arial" w:hAnsi="Arial"/>
         </w:rPr>
         <w:t xml:space="preserve"> to one idea and credited to Reiss and Vermeer (1984).</w:t>
-      </w:r>
-    </w:p>
-    <w:p>
-      <w:pPr>
-        <w:pStyle w:val="ListParagraph"/>
-        <w:numPr>
-          <w:ilvl w:val="0"/>
-          <w:numId w:val="2"/>
-        </w:numPr>
-        <w:spacing w:after="80" w:line="290"/>
-      </w:pPr>
-      <w:r>
-        <w:rPr>
-          <w:rFonts w:ascii="Arial" w:cs="Arial" w:eastAsia="Arial" w:hAnsi="Arial"/>
-          <w:b/>
-          <w:bCs/>
-        </w:rPr>
-        <w:t xml:space="preserve">Kuwaiti expressions.</w:t>
-      </w:r>
-      <w:r>
-        <w:rPr>
-          <w:rFonts w:ascii="Arial" w:cs="Arial" w:eastAsia="Arial" w:hAnsi="Arial"/>
-        </w:rPr>
-        <w:t xml:space="preserve"> Six were chosen and cited to the dictionary; a Modern Standard Arabic version was added for </w:t>
-      </w:r>
-      <w:r>
-        <w:rPr>
-          <w:rFonts w:ascii="Arial" w:cs="Arial" w:hAnsi="Arial"/>
-          <w:szCs w:val="23"/>
-          <w:rtl/>
-        </w:rPr>
-        <w:t xml:space="preserve">الحجي سهل</w:t>
-      </w:r>
-      <w:r>
-        <w:rPr>
-          <w:rFonts w:ascii="Arial" w:cs="Arial" w:eastAsia="Arial" w:hAnsi="Arial"/>
-        </w:rPr>
-        <w:t xml:space="preserve">.</w:t>
       </w:r>
     </w:p>
     <w:p>
@@ -6034,7 +5921,7 @@
                 <w:sz w:val="19"/>
                 <w:szCs w:val="19"/>
               </w:rPr>
-              <w:t xml:space="preserve">Idioms with no Arabic or Kuwaiti equivalent (for example, nosy parker, near and dear to my heart, mister perfect); an unfinished entry; idioms whose English needed correcting (cup runneth over, rear-view mirror, just deserts)</w:t>
+              <w:t xml:space="preserve">Idioms with no Arabic or colloquial equivalent (for example, nosy parker, near and dear to my heart, mister perfect); an unfinished entry; idioms whose English needed correcting (cup runneth over, rear-view mirror, just deserts)</w:t>
             </w:r>
           </w:p>
         </w:tc>
@@ -6129,7 +6016,7 @@
                 <w:sz w:val="19"/>
                 <w:szCs w:val="19"/>
               </w:rPr>
-              <w:t xml:space="preserve">Dialect equivalents. The handbook keeps only six Kuwaiti expressions from the dictionary.</w:t>
+              <w:t xml:space="preserve">Dialect equivalents. The handbook’s Kuwaiti expressions come from a separate source (Section 7.4).</w:t>
             </w:r>
           </w:p>
         </w:tc>
@@ -6164,7 +6051,7 @@
                 <w:sz w:val="19"/>
                 <w:szCs w:val="19"/>
               </w:rPr>
-              <w:t xml:space="preserve">Denotation and connotation; the foreign-to-target culture point; the empty References heading; the table of phrases with Kuwaiti equivalents</w:t>
+              <w:t xml:space="preserve">Denotation and connotation; the foreign-to-target culture point; the empty References heading; the table of phrases with colloquial equivalents</w:t>
             </w:r>
           </w:p>
         </w:tc>
@@ -8072,7 +7959,7 @@
                 <w:sz w:val="19"/>
                 <w:szCs w:val="19"/>
               </w:rPr>
-              <w:t xml:space="preserve">Her proposal of idioms as a separate chapter, widened to proverbs, fixed expressions and Kuwaiti expressions</w:t>
+              <w:t xml:space="preserve">Her proposal of idioms as a separate chapter, widened to proverbs, fixed expressions and fixed expressions</w:t>
             </w:r>
           </w:p>
         </w:tc>
@@ -17276,7 +17163,35 @@
         <w:rPr>
           <w:rFonts w:ascii="Arial" w:cs="Arial" w:eastAsia="Arial" w:hAnsi="Arial"/>
         </w:rPr>
-        <w:t xml:space="preserve"> Six expressions were chosen from the Kuwaiti expressions dictionary, following the proposal of Loulwah Bin Saeed (Section 4.2), and placed in Chapters 9, 15 and 27, with their English equivalents.</w:t>
+        <w:t xml:space="preserve"> Six expressions were chosen by Shaikha Alkhaldi from the letter alif (</w:t>
+      </w:r>
+      <w:r>
+        <w:rPr>
+          <w:rFonts w:ascii="Arial" w:cs="Arial" w:hAnsi="Arial"/>
+          <w:szCs w:val="23"/>
+          <w:rtl/>
+        </w:rPr>
+        <w:t xml:space="preserve">حرف الألف</w:t>
+      </w:r>
+      <w:r>
+        <w:rPr>
+          <w:rFonts w:ascii="Arial" w:cs="Arial" w:eastAsia="Arial" w:hAnsi="Arial"/>
+        </w:rPr>
+        <w:t xml:space="preserve">) section of the dictionary of comparative Kuwaiti idiomatic expressions (</w:t>
+      </w:r>
+      <w:r>
+        <w:rPr>
+          <w:rFonts w:ascii="Arial" w:cs="Arial" w:hAnsi="Arial"/>
+          <w:szCs w:val="23"/>
+          <w:rtl/>
+        </w:rPr>
+        <w:t xml:space="preserve">معجم التعابير الاصطلاحية الكويتية المقارنة</w:t>
+      </w:r>
+      <w:r>
+        <w:rPr>
+          <w:rFonts w:ascii="Arial" w:cs="Arial" w:eastAsia="Arial" w:hAnsi="Arial"/>
+        </w:rPr>
+        <w:t xml:space="preserve">) by Dr. Mohammed bin Nasser, who provided it, and are cited to him (Bin Nasser, n.d.). The dictionary is an unpublished book, and only the letter alif section has been received, so the selection is limited to it. The team has not yet agreed on any of the expressions. They are placed in Chapters 9, 15 and 27, with their English equivalents.</w:t>
       </w:r>
     </w:p>
     <w:p>
@@ -22914,131 +22829,6 @@
     <w:p>
       <w:pPr>
         <w:spacing w:after="160"/>
-      </w:pPr>
-    </w:p>
-    <w:p>
-      <w:pPr>
-        <w:pStyle w:val="Heading1"/>
-      </w:pPr>
-      <w:r>
-        <w:t xml:space="preserve">9. Still open for the team</w:t>
-      </w:r>
-    </w:p>
-    <w:p>
-      <w:pPr>
-        <w:spacing w:after="140" w:line="300"/>
-        <w:jc w:val="both"/>
-      </w:pPr>
-      <w:r>
-        <w:rPr>
-          <w:rFonts w:ascii="Arial" w:cs="Arial" w:eastAsia="Arial" w:hAnsi="Arial"/>
-        </w:rPr>
-        <w:t xml:space="preserve">Because this is a draft, the following need the team’s decision:</w:t>
-      </w:r>
-    </w:p>
-    <w:p>
-      <w:pPr>
-        <w:pStyle w:val="ListParagraph"/>
-        <w:numPr>
-          <w:ilvl w:val="0"/>
-          <w:numId w:val="2"/>
-        </w:numPr>
-        <w:spacing w:after="80" w:line="290"/>
-      </w:pPr>
-      <w:r>
-        <w:rPr>
-          <w:rFonts w:ascii="Arial" w:cs="Arial" w:eastAsia="Arial" w:hAnsi="Arial"/>
-          <w:color w:val="C00000"/>
-        </w:rPr>
-        <w:t xml:space="preserve">Whether the material not yet received should go into this edition: Loulwah’s Principles of Translation notes, the Gamal article and AVT Theory; Masooma’s Translation Texts and stylistics summary; the three sample analyses.</w:t>
-      </w:r>
-    </w:p>
-    <w:p>
-      <w:pPr>
-        <w:pStyle w:val="ListParagraph"/>
-        <w:numPr>
-          <w:ilvl w:val="0"/>
-          <w:numId w:val="2"/>
-        </w:numPr>
-        <w:spacing w:after="80" w:line="290"/>
-      </w:pPr>
-      <w:r>
-        <w:rPr>
-          <w:rFonts w:ascii="Arial" w:cs="Arial" w:eastAsia="Arial" w:hAnsi="Arial"/>
-          <w:color w:val="C00000"/>
-        </w:rPr>
-        <w:t xml:space="preserve">Who shared the Kuwaiti expressions dictionary, and its author, publisher and year, so that it can be cited in full.</w:t>
-      </w:r>
-    </w:p>
-    <w:p>
-      <w:pPr>
-        <w:pStyle w:val="ListParagraph"/>
-        <w:numPr>
-          <w:ilvl w:val="0"/>
-          <w:numId w:val="2"/>
-        </w:numPr>
-        <w:spacing w:after="80" w:line="290"/>
-      </w:pPr>
-      <w:r>
-        <w:rPr>
-          <w:rFonts w:ascii="Arial" w:cs="Arial" w:eastAsia="Arial" w:hAnsi="Arial"/>
-          <w:color w:val="C00000"/>
-        </w:rPr>
-        <w:t xml:space="preserve">The author and publication details of the text </w:t>
-      </w:r>
-      <w:r>
-        <w:rPr>
-          <w:rFonts w:ascii="Arial" w:cs="Arial" w:hAnsi="Arial"/>
-          <w:szCs w:val="23"/>
-          <w:rtl/>
-        </w:rPr>
-        <w:t xml:space="preserve">الترجمة: ماهيتها وكيفيتها</w:t>
-      </w:r>
-      <w:r>
-        <w:rPr>
-          <w:rFonts w:ascii="Arial" w:cs="Arial" w:eastAsia="Arial" w:hAnsi="Arial"/>
-          <w:color w:val="C00000"/>
-        </w:rPr>
-        <w:t xml:space="preserve">, so that the two idioms taken from it can be cited in full.</w:t>
-      </w:r>
-    </w:p>
-    <w:p>
-      <w:pPr>
-        <w:pStyle w:val="ListParagraph"/>
-        <w:numPr>
-          <w:ilvl w:val="0"/>
-          <w:numId w:val="2"/>
-        </w:numPr>
-        <w:spacing w:after="80" w:line="290"/>
-      </w:pPr>
-      <w:r>
-        <w:rPr>
-          <w:rFonts w:ascii="Arial" w:cs="Arial" w:eastAsia="Arial" w:hAnsi="Arial"/>
-          <w:color w:val="C00000"/>
-        </w:rPr>
-        <w:t xml:space="preserve">The page size: B5 now; A5 was the size of the model book.</w:t>
-      </w:r>
-    </w:p>
-    <w:p>
-      <w:pPr>
-        <w:pStyle w:val="ListParagraph"/>
-        <w:numPr>
-          <w:ilvl w:val="0"/>
-          <w:numId w:val="2"/>
-        </w:numPr>
-        <w:spacing w:after="80" w:line="290"/>
-      </w:pPr>
-      <w:r>
-        <w:rPr>
-          <w:rFonts w:ascii="Arial" w:cs="Arial" w:eastAsia="Arial" w:hAnsi="Arial"/>
-          <w:color w:val="C00000"/>
-        </w:rPr>
-        <w:t xml:space="preserve">Before printing: a full read by a native Arabic specialist; checking the ten Did you know? facts and the open reference points listed in the Final Report.</w:t>
-      </w:r>
-    </w:p>
-    <w:p>
-      <w:pPr>
-        <w:spacing w:after="60"/>
       </w:pPr>
     </w:p>
     <w:sectPr>

</xml_diff>